<commit_message>
CF ajustado - actividad
</commit_message>
<xml_diff>
--- a/fuentes/12310018_CF02_Actividad didactica.docx
+++ b/fuentes/12310018_CF02_Actividad didactica.docx
@@ -768,6 +768,7 @@
                 <w:lang w:val="pt-PT"/>
               </w:rPr>
             </w:pPr>
+            <w:proofErr w:type="spellStart"/>
             <w:r>
               <w:rPr>
                 <w:rFonts w:eastAsia="Calibri"/>
@@ -776,7 +777,40 @@
                 <w:color w:val="000000" w:themeColor="text1"/>
                 <w:lang w:val="pt-PT"/>
               </w:rPr>
-              <w:t>Rta(s) correcta(s) (x)</w:t>
+              <w:t>Rta</w:t>
+            </w:r>
+            <w:proofErr w:type="spellEnd"/>
+            <w:r>
+              <w:rPr>
+                <w:rFonts w:eastAsia="Calibri"/>
+                <w:b/>
+                <w:bCs/>
+                <w:color w:val="000000" w:themeColor="text1"/>
+                <w:lang w:val="pt-PT"/>
+              </w:rPr>
+              <w:t xml:space="preserve">(s) </w:t>
+            </w:r>
+            <w:proofErr w:type="spellStart"/>
+            <w:r>
+              <w:rPr>
+                <w:rFonts w:eastAsia="Calibri"/>
+                <w:b/>
+                <w:bCs/>
+                <w:color w:val="000000" w:themeColor="text1"/>
+                <w:lang w:val="pt-PT"/>
+              </w:rPr>
+              <w:t>correcta</w:t>
+            </w:r>
+            <w:proofErr w:type="spellEnd"/>
+            <w:r>
+              <w:rPr>
+                <w:rFonts w:eastAsia="Calibri"/>
+                <w:b/>
+                <w:bCs/>
+                <w:color w:val="000000" w:themeColor="text1"/>
+                <w:lang w:val="pt-PT"/>
+              </w:rPr>
+              <w:t>(s) (x)</w:t>
             </w:r>
           </w:p>
         </w:tc>
@@ -1267,7 +1301,6 @@
                 <w:bCs/>
                 <w:color w:val="000000" w:themeColor="text1"/>
               </w:rPr>
-              <w:lastRenderedPageBreak/>
               <w:t>Comentario respuesta incorrecta</w:t>
             </w:r>
           </w:p>
@@ -1390,6 +1423,7 @@
                 <w:lang w:val="pt-PT"/>
               </w:rPr>
             </w:pPr>
+            <w:proofErr w:type="spellStart"/>
             <w:r>
               <w:rPr>
                 <w:rFonts w:eastAsia="Calibri"/>
@@ -1398,7 +1432,40 @@
                 <w:color w:val="000000" w:themeColor="text1"/>
                 <w:lang w:val="pt-PT"/>
               </w:rPr>
-              <w:t>Rta(s) correcta(s) (x)</w:t>
+              <w:t>Rta</w:t>
+            </w:r>
+            <w:proofErr w:type="spellEnd"/>
+            <w:r>
+              <w:rPr>
+                <w:rFonts w:eastAsia="Calibri"/>
+                <w:b/>
+                <w:bCs/>
+                <w:color w:val="000000" w:themeColor="text1"/>
+                <w:lang w:val="pt-PT"/>
+              </w:rPr>
+              <w:t xml:space="preserve">(s) </w:t>
+            </w:r>
+            <w:proofErr w:type="spellStart"/>
+            <w:r>
+              <w:rPr>
+                <w:rFonts w:eastAsia="Calibri"/>
+                <w:b/>
+                <w:bCs/>
+                <w:color w:val="000000" w:themeColor="text1"/>
+                <w:lang w:val="pt-PT"/>
+              </w:rPr>
+              <w:t>correcta</w:t>
+            </w:r>
+            <w:proofErr w:type="spellEnd"/>
+            <w:r>
+              <w:rPr>
+                <w:rFonts w:eastAsia="Calibri"/>
+                <w:b/>
+                <w:bCs/>
+                <w:color w:val="000000" w:themeColor="text1"/>
+                <w:lang w:val="pt-PT"/>
+              </w:rPr>
+              <w:t>(s) (x)</w:t>
             </w:r>
           </w:p>
         </w:tc>
@@ -1947,6 +2014,7 @@
                 <w:lang w:val="pt-PT"/>
               </w:rPr>
             </w:pPr>
+            <w:proofErr w:type="spellStart"/>
             <w:r>
               <w:rPr>
                 <w:rFonts w:eastAsia="Calibri"/>
@@ -1955,7 +2023,40 @@
                 <w:color w:val="000000" w:themeColor="text1"/>
                 <w:lang w:val="pt-PT"/>
               </w:rPr>
-              <w:t>Rta(s) correcta(s) (x)</w:t>
+              <w:t>Rta</w:t>
+            </w:r>
+            <w:proofErr w:type="spellEnd"/>
+            <w:r>
+              <w:rPr>
+                <w:rFonts w:eastAsia="Calibri"/>
+                <w:b/>
+                <w:bCs/>
+                <w:color w:val="000000" w:themeColor="text1"/>
+                <w:lang w:val="pt-PT"/>
+              </w:rPr>
+              <w:t xml:space="preserve">(s) </w:t>
+            </w:r>
+            <w:proofErr w:type="spellStart"/>
+            <w:r>
+              <w:rPr>
+                <w:rFonts w:eastAsia="Calibri"/>
+                <w:b/>
+                <w:bCs/>
+                <w:color w:val="000000" w:themeColor="text1"/>
+                <w:lang w:val="pt-PT"/>
+              </w:rPr>
+              <w:t>correcta</w:t>
+            </w:r>
+            <w:proofErr w:type="spellEnd"/>
+            <w:r>
+              <w:rPr>
+                <w:rFonts w:eastAsia="Calibri"/>
+                <w:b/>
+                <w:bCs/>
+                <w:color w:val="000000" w:themeColor="text1"/>
+                <w:lang w:val="pt-PT"/>
+              </w:rPr>
+              <w:t>(s) (x)</w:t>
             </w:r>
           </w:p>
         </w:tc>
@@ -2454,6 +2555,7 @@
                 <w:lang w:val="pt-PT"/>
               </w:rPr>
             </w:pPr>
+            <w:proofErr w:type="spellStart"/>
             <w:r>
               <w:rPr>
                 <w:rFonts w:eastAsia="Calibri"/>
@@ -2462,7 +2564,40 @@
                 <w:color w:val="000000" w:themeColor="text1"/>
                 <w:lang w:val="pt-PT"/>
               </w:rPr>
-              <w:t>Rta(s) correcta(s) (x)</w:t>
+              <w:t>Rta</w:t>
+            </w:r>
+            <w:proofErr w:type="spellEnd"/>
+            <w:r>
+              <w:rPr>
+                <w:rFonts w:eastAsia="Calibri"/>
+                <w:b/>
+                <w:bCs/>
+                <w:color w:val="000000" w:themeColor="text1"/>
+                <w:lang w:val="pt-PT"/>
+              </w:rPr>
+              <w:t xml:space="preserve">(s) </w:t>
+            </w:r>
+            <w:proofErr w:type="spellStart"/>
+            <w:r>
+              <w:rPr>
+                <w:rFonts w:eastAsia="Calibri"/>
+                <w:b/>
+                <w:bCs/>
+                <w:color w:val="000000" w:themeColor="text1"/>
+                <w:lang w:val="pt-PT"/>
+              </w:rPr>
+              <w:t>correcta</w:t>
+            </w:r>
+            <w:proofErr w:type="spellEnd"/>
+            <w:r>
+              <w:rPr>
+                <w:rFonts w:eastAsia="Calibri"/>
+                <w:b/>
+                <w:bCs/>
+                <w:color w:val="000000" w:themeColor="text1"/>
+                <w:lang w:val="pt-PT"/>
+              </w:rPr>
+              <w:t>(s) (x)</w:t>
             </w:r>
           </w:p>
         </w:tc>
@@ -3050,6 +3185,7 @@
                 <w:lang w:val="pt-PT"/>
               </w:rPr>
             </w:pPr>
+            <w:proofErr w:type="spellStart"/>
             <w:r>
               <w:rPr>
                 <w:rFonts w:eastAsia="Calibri"/>
@@ -3058,7 +3194,40 @@
                 <w:color w:val="000000" w:themeColor="text1"/>
                 <w:lang w:val="pt-PT"/>
               </w:rPr>
-              <w:t>Rta(s) correcta(s) (x)</w:t>
+              <w:t>Rta</w:t>
+            </w:r>
+            <w:proofErr w:type="spellEnd"/>
+            <w:r>
+              <w:rPr>
+                <w:rFonts w:eastAsia="Calibri"/>
+                <w:b/>
+                <w:bCs/>
+                <w:color w:val="000000" w:themeColor="text1"/>
+                <w:lang w:val="pt-PT"/>
+              </w:rPr>
+              <w:t xml:space="preserve">(s) </w:t>
+            </w:r>
+            <w:proofErr w:type="spellStart"/>
+            <w:r>
+              <w:rPr>
+                <w:rFonts w:eastAsia="Calibri"/>
+                <w:b/>
+                <w:bCs/>
+                <w:color w:val="000000" w:themeColor="text1"/>
+                <w:lang w:val="pt-PT"/>
+              </w:rPr>
+              <w:t>correcta</w:t>
+            </w:r>
+            <w:proofErr w:type="spellEnd"/>
+            <w:r>
+              <w:rPr>
+                <w:rFonts w:eastAsia="Calibri"/>
+                <w:b/>
+                <w:bCs/>
+                <w:color w:val="000000" w:themeColor="text1"/>
+                <w:lang w:val="pt-PT"/>
+              </w:rPr>
+              <w:t>(s) (x)</w:t>
             </w:r>
           </w:p>
         </w:tc>
@@ -3553,7 +3722,6 @@
                 <w:rFonts w:eastAsia="Calibri"/>
                 <w:color w:val="000000" w:themeColor="text1"/>
               </w:rPr>
-              <w:lastRenderedPageBreak/>
               <w:t xml:space="preserve">Pregunta 6 </w:t>
             </w:r>
           </w:p>
@@ -3609,6 +3777,7 @@
                 <w:lang w:val="pt-PT"/>
               </w:rPr>
             </w:pPr>
+            <w:proofErr w:type="spellStart"/>
             <w:r>
               <w:rPr>
                 <w:rFonts w:eastAsia="Calibri"/>
@@ -3617,7 +3786,40 @@
                 <w:color w:val="000000" w:themeColor="text1"/>
                 <w:lang w:val="pt-PT"/>
               </w:rPr>
-              <w:t>Rta(s) correcta(s) (x)</w:t>
+              <w:t>Rta</w:t>
+            </w:r>
+            <w:proofErr w:type="spellEnd"/>
+            <w:r>
+              <w:rPr>
+                <w:rFonts w:eastAsia="Calibri"/>
+                <w:b/>
+                <w:bCs/>
+                <w:color w:val="000000" w:themeColor="text1"/>
+                <w:lang w:val="pt-PT"/>
+              </w:rPr>
+              <w:t xml:space="preserve">(s) </w:t>
+            </w:r>
+            <w:proofErr w:type="spellStart"/>
+            <w:r>
+              <w:rPr>
+                <w:rFonts w:eastAsia="Calibri"/>
+                <w:b/>
+                <w:bCs/>
+                <w:color w:val="000000" w:themeColor="text1"/>
+                <w:lang w:val="pt-PT"/>
+              </w:rPr>
+              <w:t>correcta</w:t>
+            </w:r>
+            <w:proofErr w:type="spellEnd"/>
+            <w:r>
+              <w:rPr>
+                <w:rFonts w:eastAsia="Calibri"/>
+                <w:b/>
+                <w:bCs/>
+                <w:color w:val="000000" w:themeColor="text1"/>
+                <w:lang w:val="pt-PT"/>
+              </w:rPr>
+              <w:t>(s) (x)</w:t>
             </w:r>
           </w:p>
         </w:tc>
@@ -4123,6 +4325,7 @@
                 <w:lang w:val="pt-PT"/>
               </w:rPr>
             </w:pPr>
+            <w:proofErr w:type="spellStart"/>
             <w:r>
               <w:rPr>
                 <w:rFonts w:eastAsia="Calibri"/>
@@ -4131,7 +4334,40 @@
                 <w:color w:val="000000" w:themeColor="text1"/>
                 <w:lang w:val="pt-PT"/>
               </w:rPr>
-              <w:t>Rta(s) correcta(s) (x)</w:t>
+              <w:t>Rta</w:t>
+            </w:r>
+            <w:proofErr w:type="spellEnd"/>
+            <w:r>
+              <w:rPr>
+                <w:rFonts w:eastAsia="Calibri"/>
+                <w:b/>
+                <w:bCs/>
+                <w:color w:val="000000" w:themeColor="text1"/>
+                <w:lang w:val="pt-PT"/>
+              </w:rPr>
+              <w:t xml:space="preserve">(s) </w:t>
+            </w:r>
+            <w:proofErr w:type="spellStart"/>
+            <w:r>
+              <w:rPr>
+                <w:rFonts w:eastAsia="Calibri"/>
+                <w:b/>
+                <w:bCs/>
+                <w:color w:val="000000" w:themeColor="text1"/>
+                <w:lang w:val="pt-PT"/>
+              </w:rPr>
+              <w:t>correcta</w:t>
+            </w:r>
+            <w:proofErr w:type="spellEnd"/>
+            <w:r>
+              <w:rPr>
+                <w:rFonts w:eastAsia="Calibri"/>
+                <w:b/>
+                <w:bCs/>
+                <w:color w:val="000000" w:themeColor="text1"/>
+                <w:lang w:val="pt-PT"/>
+              </w:rPr>
+              <w:t>(s) (x)</w:t>
             </w:r>
           </w:p>
         </w:tc>
@@ -4650,6 +4886,7 @@
                 <w:lang w:val="pt-PT"/>
               </w:rPr>
             </w:pPr>
+            <w:proofErr w:type="spellStart"/>
             <w:r>
               <w:rPr>
                 <w:rFonts w:eastAsia="Calibri"/>
@@ -4658,7 +4895,40 @@
                 <w:color w:val="000000" w:themeColor="text1"/>
                 <w:lang w:val="pt-PT"/>
               </w:rPr>
-              <w:t>Rta(s) correcta(s) (x)</w:t>
+              <w:t>Rta</w:t>
+            </w:r>
+            <w:proofErr w:type="spellEnd"/>
+            <w:r>
+              <w:rPr>
+                <w:rFonts w:eastAsia="Calibri"/>
+                <w:b/>
+                <w:bCs/>
+                <w:color w:val="000000" w:themeColor="text1"/>
+                <w:lang w:val="pt-PT"/>
+              </w:rPr>
+              <w:t xml:space="preserve">(s) </w:t>
+            </w:r>
+            <w:proofErr w:type="spellStart"/>
+            <w:r>
+              <w:rPr>
+                <w:rFonts w:eastAsia="Calibri"/>
+                <w:b/>
+                <w:bCs/>
+                <w:color w:val="000000" w:themeColor="text1"/>
+                <w:lang w:val="pt-PT"/>
+              </w:rPr>
+              <w:t>correcta</w:t>
+            </w:r>
+            <w:proofErr w:type="spellEnd"/>
+            <w:r>
+              <w:rPr>
+                <w:rFonts w:eastAsia="Calibri"/>
+                <w:b/>
+                <w:bCs/>
+                <w:color w:val="000000" w:themeColor="text1"/>
+                <w:lang w:val="pt-PT"/>
+              </w:rPr>
+              <w:t>(s) (x)</w:t>
             </w:r>
           </w:p>
         </w:tc>
@@ -5165,6 +5435,7 @@
                 <w:lang w:val="pt-PT"/>
               </w:rPr>
             </w:pPr>
+            <w:proofErr w:type="spellStart"/>
             <w:r>
               <w:rPr>
                 <w:rFonts w:eastAsia="Calibri"/>
@@ -5173,7 +5444,40 @@
                 <w:color w:val="000000" w:themeColor="text1"/>
                 <w:lang w:val="pt-PT"/>
               </w:rPr>
-              <w:t>Rta(s) correcta(s) (x)</w:t>
+              <w:t>Rta</w:t>
+            </w:r>
+            <w:proofErr w:type="spellEnd"/>
+            <w:r>
+              <w:rPr>
+                <w:rFonts w:eastAsia="Calibri"/>
+                <w:b/>
+                <w:bCs/>
+                <w:color w:val="000000" w:themeColor="text1"/>
+                <w:lang w:val="pt-PT"/>
+              </w:rPr>
+              <w:t xml:space="preserve">(s) </w:t>
+            </w:r>
+            <w:proofErr w:type="spellStart"/>
+            <w:r>
+              <w:rPr>
+                <w:rFonts w:eastAsia="Calibri"/>
+                <w:b/>
+                <w:bCs/>
+                <w:color w:val="000000" w:themeColor="text1"/>
+                <w:lang w:val="pt-PT"/>
+              </w:rPr>
+              <w:t>correcta</w:t>
+            </w:r>
+            <w:proofErr w:type="spellEnd"/>
+            <w:r>
+              <w:rPr>
+                <w:rFonts w:eastAsia="Calibri"/>
+                <w:b/>
+                <w:bCs/>
+                <w:color w:val="000000" w:themeColor="text1"/>
+                <w:lang w:val="pt-PT"/>
+              </w:rPr>
+              <w:t>(s) (x)</w:t>
             </w:r>
           </w:p>
         </w:tc>
@@ -5739,6 +6043,7 @@
                 <w:lang w:val="pt-PT"/>
               </w:rPr>
             </w:pPr>
+            <w:proofErr w:type="spellStart"/>
             <w:r>
               <w:rPr>
                 <w:rFonts w:eastAsia="Calibri"/>
@@ -5747,7 +6052,40 @@
                 <w:color w:val="000000" w:themeColor="text1"/>
                 <w:lang w:val="pt-PT"/>
               </w:rPr>
-              <w:t>Rta(s) correcta(s) (x)</w:t>
+              <w:t>Rta</w:t>
+            </w:r>
+            <w:proofErr w:type="spellEnd"/>
+            <w:r>
+              <w:rPr>
+                <w:rFonts w:eastAsia="Calibri"/>
+                <w:b/>
+                <w:bCs/>
+                <w:color w:val="000000" w:themeColor="text1"/>
+                <w:lang w:val="pt-PT"/>
+              </w:rPr>
+              <w:t xml:space="preserve">(s) </w:t>
+            </w:r>
+            <w:proofErr w:type="spellStart"/>
+            <w:r>
+              <w:rPr>
+                <w:rFonts w:eastAsia="Calibri"/>
+                <w:b/>
+                <w:bCs/>
+                <w:color w:val="000000" w:themeColor="text1"/>
+                <w:lang w:val="pt-PT"/>
+              </w:rPr>
+              <w:t>correcta</w:t>
+            </w:r>
+            <w:proofErr w:type="spellEnd"/>
+            <w:r>
+              <w:rPr>
+                <w:rFonts w:eastAsia="Calibri"/>
+                <w:b/>
+                <w:bCs/>
+                <w:color w:val="000000" w:themeColor="text1"/>
+                <w:lang w:val="pt-PT"/>
+              </w:rPr>
+              <w:t>(s) (x)</w:t>
             </w:r>
           </w:p>
         </w:tc>
@@ -5861,7 +6199,6 @@
                 <w:bCs/>
                 <w:color w:val="000000" w:themeColor="text1"/>
               </w:rPr>
-              <w:lastRenderedPageBreak/>
               <w:t>Opción b)</w:t>
             </w:r>
           </w:p>
@@ -6277,6 +6614,7 @@
                 <w:lang w:val="pt-PT"/>
               </w:rPr>
             </w:pPr>
+            <w:proofErr w:type="spellStart"/>
             <w:r>
               <w:rPr>
                 <w:rFonts w:eastAsia="Calibri"/>
@@ -6285,7 +6623,40 @@
                 <w:color w:val="000000" w:themeColor="text1"/>
                 <w:lang w:val="pt-PT"/>
               </w:rPr>
-              <w:t>Rta(s) correcta(s) (x)</w:t>
+              <w:t>Rta</w:t>
+            </w:r>
+            <w:proofErr w:type="spellEnd"/>
+            <w:r>
+              <w:rPr>
+                <w:rFonts w:eastAsia="Calibri"/>
+                <w:b/>
+                <w:bCs/>
+                <w:color w:val="000000" w:themeColor="text1"/>
+                <w:lang w:val="pt-PT"/>
+              </w:rPr>
+              <w:t xml:space="preserve">(s) </w:t>
+            </w:r>
+            <w:proofErr w:type="spellStart"/>
+            <w:r>
+              <w:rPr>
+                <w:rFonts w:eastAsia="Calibri"/>
+                <w:b/>
+                <w:bCs/>
+                <w:color w:val="000000" w:themeColor="text1"/>
+                <w:lang w:val="pt-PT"/>
+              </w:rPr>
+              <w:t>correcta</w:t>
+            </w:r>
+            <w:proofErr w:type="spellEnd"/>
+            <w:r>
+              <w:rPr>
+                <w:rFonts w:eastAsia="Calibri"/>
+                <w:b/>
+                <w:bCs/>
+                <w:color w:val="000000" w:themeColor="text1"/>
+                <w:lang w:val="pt-PT"/>
+              </w:rPr>
+              <w:t>(s) (x)</w:t>
             </w:r>
           </w:p>
         </w:tc>
@@ -6844,6 +7215,7 @@
                 <w:lang w:val="pt-PT"/>
               </w:rPr>
             </w:pPr>
+            <w:proofErr w:type="spellStart"/>
             <w:r>
               <w:rPr>
                 <w:rFonts w:eastAsia="Calibri"/>
@@ -6852,7 +7224,40 @@
                 <w:color w:val="000000" w:themeColor="text1"/>
                 <w:lang w:val="pt-PT"/>
               </w:rPr>
-              <w:t>Rta(s) correcta(s) (x)</w:t>
+              <w:t>Rta</w:t>
+            </w:r>
+            <w:proofErr w:type="spellEnd"/>
+            <w:r>
+              <w:rPr>
+                <w:rFonts w:eastAsia="Calibri"/>
+                <w:b/>
+                <w:bCs/>
+                <w:color w:val="000000" w:themeColor="text1"/>
+                <w:lang w:val="pt-PT"/>
+              </w:rPr>
+              <w:t xml:space="preserve">(s) </w:t>
+            </w:r>
+            <w:proofErr w:type="spellStart"/>
+            <w:r>
+              <w:rPr>
+                <w:rFonts w:eastAsia="Calibri"/>
+                <w:b/>
+                <w:bCs/>
+                <w:color w:val="000000" w:themeColor="text1"/>
+                <w:lang w:val="pt-PT"/>
+              </w:rPr>
+              <w:t>correcta</w:t>
+            </w:r>
+            <w:proofErr w:type="spellEnd"/>
+            <w:r>
+              <w:rPr>
+                <w:rFonts w:eastAsia="Calibri"/>
+                <w:b/>
+                <w:bCs/>
+                <w:color w:val="000000" w:themeColor="text1"/>
+                <w:lang w:val="pt-PT"/>
+              </w:rPr>
+              <w:t>(s) (x)</w:t>
             </w:r>
           </w:p>
         </w:tc>
@@ -7364,6 +7769,7 @@
                 <w:lang w:val="pt-PT"/>
               </w:rPr>
             </w:pPr>
+            <w:proofErr w:type="spellStart"/>
             <w:r>
               <w:rPr>
                 <w:rFonts w:eastAsia="Calibri"/>
@@ -7372,7 +7778,40 @@
                 <w:color w:val="000000" w:themeColor="text1"/>
                 <w:lang w:val="pt-PT"/>
               </w:rPr>
-              <w:t>Rta(s) correcta(s) (x)</w:t>
+              <w:t>Rta</w:t>
+            </w:r>
+            <w:proofErr w:type="spellEnd"/>
+            <w:r>
+              <w:rPr>
+                <w:rFonts w:eastAsia="Calibri"/>
+                <w:b/>
+                <w:bCs/>
+                <w:color w:val="000000" w:themeColor="text1"/>
+                <w:lang w:val="pt-PT"/>
+              </w:rPr>
+              <w:t xml:space="preserve">(s) </w:t>
+            </w:r>
+            <w:proofErr w:type="spellStart"/>
+            <w:r>
+              <w:rPr>
+                <w:rFonts w:eastAsia="Calibri"/>
+                <w:b/>
+                <w:bCs/>
+                <w:color w:val="000000" w:themeColor="text1"/>
+                <w:lang w:val="pt-PT"/>
+              </w:rPr>
+              <w:t>correcta</w:t>
+            </w:r>
+            <w:proofErr w:type="spellEnd"/>
+            <w:r>
+              <w:rPr>
+                <w:rFonts w:eastAsia="Calibri"/>
+                <w:b/>
+                <w:bCs/>
+                <w:color w:val="000000" w:themeColor="text1"/>
+                <w:lang w:val="pt-PT"/>
+              </w:rPr>
+              <w:t>(s) (x)</w:t>
             </w:r>
           </w:p>
         </w:tc>
@@ -7859,6 +8298,7 @@
                 <w:lang w:val="pt-PT"/>
               </w:rPr>
             </w:pPr>
+            <w:proofErr w:type="spellStart"/>
             <w:r>
               <w:rPr>
                 <w:rFonts w:eastAsia="Calibri"/>
@@ -7867,7 +8307,40 @@
                 <w:color w:val="000000" w:themeColor="text1"/>
                 <w:lang w:val="pt-PT"/>
               </w:rPr>
-              <w:t>Rta(s) correcta(s) (x)</w:t>
+              <w:t>Rta</w:t>
+            </w:r>
+            <w:proofErr w:type="spellEnd"/>
+            <w:r>
+              <w:rPr>
+                <w:rFonts w:eastAsia="Calibri"/>
+                <w:b/>
+                <w:bCs/>
+                <w:color w:val="000000" w:themeColor="text1"/>
+                <w:lang w:val="pt-PT"/>
+              </w:rPr>
+              <w:t xml:space="preserve">(s) </w:t>
+            </w:r>
+            <w:proofErr w:type="spellStart"/>
+            <w:r>
+              <w:rPr>
+                <w:rFonts w:eastAsia="Calibri"/>
+                <w:b/>
+                <w:bCs/>
+                <w:color w:val="000000" w:themeColor="text1"/>
+                <w:lang w:val="pt-PT"/>
+              </w:rPr>
+              <w:t>correcta</w:t>
+            </w:r>
+            <w:proofErr w:type="spellEnd"/>
+            <w:r>
+              <w:rPr>
+                <w:rFonts w:eastAsia="Calibri"/>
+                <w:b/>
+                <w:bCs/>
+                <w:color w:val="000000" w:themeColor="text1"/>
+                <w:lang w:val="pt-PT"/>
+              </w:rPr>
+              <w:t>(s) (x)</w:t>
             </w:r>
           </w:p>
         </w:tc>
@@ -8197,7 +8670,6 @@
                 <w:bCs/>
                 <w:color w:val="000000" w:themeColor="text1"/>
               </w:rPr>
-              <w:lastRenderedPageBreak/>
               <w:t>Comentario respuesta correcta</w:t>
             </w:r>
           </w:p>
@@ -8354,6 +8826,7 @@
                 <w:lang w:val="pt-PT"/>
               </w:rPr>
             </w:pPr>
+            <w:proofErr w:type="spellStart"/>
             <w:r>
               <w:rPr>
                 <w:rFonts w:eastAsia="Calibri"/>
@@ -8362,7 +8835,40 @@
                 <w:color w:val="000000" w:themeColor="text1"/>
                 <w:lang w:val="pt-PT"/>
               </w:rPr>
-              <w:t>Rta(s) correcta(s) (x)</w:t>
+              <w:t>Rta</w:t>
+            </w:r>
+            <w:proofErr w:type="spellEnd"/>
+            <w:r>
+              <w:rPr>
+                <w:rFonts w:eastAsia="Calibri"/>
+                <w:b/>
+                <w:bCs/>
+                <w:color w:val="000000" w:themeColor="text1"/>
+                <w:lang w:val="pt-PT"/>
+              </w:rPr>
+              <w:t xml:space="preserve">(s) </w:t>
+            </w:r>
+            <w:proofErr w:type="spellStart"/>
+            <w:r>
+              <w:rPr>
+                <w:rFonts w:eastAsia="Calibri"/>
+                <w:b/>
+                <w:bCs/>
+                <w:color w:val="000000" w:themeColor="text1"/>
+                <w:lang w:val="pt-PT"/>
+              </w:rPr>
+              <w:t>correcta</w:t>
+            </w:r>
+            <w:proofErr w:type="spellEnd"/>
+            <w:r>
+              <w:rPr>
+                <w:rFonts w:eastAsia="Calibri"/>
+                <w:b/>
+                <w:bCs/>
+                <w:color w:val="000000" w:themeColor="text1"/>
+                <w:lang w:val="pt-PT"/>
+              </w:rPr>
+              <w:t>(s) (x)</w:t>
             </w:r>
           </w:p>
         </w:tc>
@@ -8870,16 +9376,17 @@
               <w:rPr>
                 <w:rFonts w:eastAsia="Calibri"/>
                 <w:b/>
-                <w:color w:val="000000" w:themeColor="text1"/>
-              </w:rPr>
-            </w:pPr>
-            <w:r>
-              <w:rPr>
-                <w:rFonts w:eastAsia="Calibri"/>
-                <w:b/>
-                <w:color w:val="000000" w:themeColor="text1"/>
-              </w:rPr>
-              <w:t>Los soportes internos son aquellos emitidos por la empresa para registrar operaciones que no afectan a terceros (como depreciaciones).</w:t>
+                <w:bCs/>
+                <w:color w:val="000000" w:themeColor="text1"/>
+              </w:rPr>
+            </w:pPr>
+            <w:r>
+              <w:rPr>
+                <w:b/>
+                <w:bCs/>
+                <w:color w:val="000000" w:themeColor="text1"/>
+              </w:rPr>
+              <w:t>¿Qué función cumplen los soportes contables dentro del proceso contable?</w:t>
             </w:r>
           </w:p>
         </w:tc>
@@ -8898,6 +9405,7 @@
                 <w:lang w:val="pt-PT"/>
               </w:rPr>
             </w:pPr>
+            <w:proofErr w:type="spellStart"/>
             <w:r>
               <w:rPr>
                 <w:rFonts w:eastAsia="Calibri"/>
@@ -8906,7 +9414,40 @@
                 <w:color w:val="000000" w:themeColor="text1"/>
                 <w:lang w:val="pt-PT"/>
               </w:rPr>
-              <w:t>Rta(s) correcta(s) (x)</w:t>
+              <w:t>Rta</w:t>
+            </w:r>
+            <w:proofErr w:type="spellEnd"/>
+            <w:r>
+              <w:rPr>
+                <w:rFonts w:eastAsia="Calibri"/>
+                <w:b/>
+                <w:bCs/>
+                <w:color w:val="000000" w:themeColor="text1"/>
+                <w:lang w:val="pt-PT"/>
+              </w:rPr>
+              <w:t xml:space="preserve">(s) </w:t>
+            </w:r>
+            <w:proofErr w:type="spellStart"/>
+            <w:r>
+              <w:rPr>
+                <w:rFonts w:eastAsia="Calibri"/>
+                <w:b/>
+                <w:bCs/>
+                <w:color w:val="000000" w:themeColor="text1"/>
+                <w:lang w:val="pt-PT"/>
+              </w:rPr>
+              <w:t>correcta</w:t>
+            </w:r>
+            <w:proofErr w:type="spellEnd"/>
+            <w:r>
+              <w:rPr>
+                <w:rFonts w:eastAsia="Calibri"/>
+                <w:b/>
+                <w:bCs/>
+                <w:color w:val="000000" w:themeColor="text1"/>
+                <w:lang w:val="pt-PT"/>
+              </w:rPr>
+              <w:t>(s) (x)</w:t>
             </w:r>
           </w:p>
         </w:tc>
@@ -8949,6 +9490,7 @@
           </w:tcPr>
           <w:p>
             <w:pPr>
+              <w:jc w:val="both"/>
               <w:cnfStyle w:val="000000000000" w:firstRow="0" w:lastRow="0" w:firstColumn="0" w:lastColumn="0" w:oddVBand="0" w:evenVBand="0" w:oddHBand="0" w:evenHBand="0" w:firstRowFirstColumn="0" w:firstRowLastColumn="0" w:lastRowFirstColumn="0" w:lastRowLastColumn="0"/>
               <w:rPr>
                 <w:rFonts w:eastAsia="Calibri"/>
@@ -8958,12 +9500,9 @@
             </w:pPr>
             <w:r>
               <w:rPr>
-                <w:rFonts w:eastAsia="Calibri"/>
-                <w:bCs/>
-                <w:iCs/>
-                <w:color w:val="000000" w:themeColor="text1"/>
-              </w:rPr>
-              <w:t>Falso.</w:t>
+                <w:color w:val="000000" w:themeColor="text1"/>
+              </w:rPr>
+              <w:t>Eliminar la necesidad de registrar operaciones en los libros contables oficiales.</w:t>
             </w:r>
           </w:p>
         </w:tc>
@@ -9023,6 +9562,7 @@
           </w:tcPr>
           <w:p>
             <w:pPr>
+              <w:jc w:val="both"/>
               <w:cnfStyle w:val="000000100000" w:firstRow="0" w:lastRow="0" w:firstColumn="0" w:lastColumn="0" w:oddVBand="0" w:evenVBand="0" w:oddHBand="1" w:evenHBand="0" w:firstRowFirstColumn="0" w:firstRowLastColumn="0" w:lastRowFirstColumn="0" w:lastRowLastColumn="0"/>
               <w:rPr>
                 <w:rFonts w:eastAsia="Calibri"/>
@@ -9032,12 +9572,9 @@
             </w:pPr>
             <w:r>
               <w:rPr>
-                <w:rFonts w:eastAsia="Calibri"/>
-                <w:b/>
-                <w:iCs/>
-                <w:color w:val="000000" w:themeColor="text1"/>
-              </w:rPr>
-              <w:t xml:space="preserve">Verdadero. </w:t>
+                <w:color w:val="000000" w:themeColor="text1"/>
+              </w:rPr>
+              <w:t>Sustituir los informes financieros en la toma de decisiones empresariales.</w:t>
             </w:r>
           </w:p>
         </w:tc>
@@ -9055,14 +9592,160 @@
                 <w:color w:val="000000" w:themeColor="text1"/>
               </w:rPr>
             </w:pPr>
-            <w:r>
-              <w:rPr>
-                <w:rFonts w:eastAsia="Calibri"/>
-                <w:b/>
+          </w:p>
+        </w:tc>
+      </w:tr>
+      <w:tr>
+        <w:trPr>
+          <w:trHeight w:val="220"/>
+        </w:trPr>
+        <w:tc>
+          <w:tcPr>
+            <w:cnfStyle w:val="001000000000" w:firstRow="0" w:lastRow="0" w:firstColumn="1" w:lastColumn="0" w:oddVBand="0" w:evenVBand="0" w:oddHBand="0" w:evenHBand="0" w:firstRowFirstColumn="0" w:firstRowLastColumn="0" w:lastRowFirstColumn="0" w:lastRowLastColumn="0"/>
+            <w:tcW w:w="2534" w:type="dxa"/>
+            <w:gridSpan w:val="2"/>
+            <w:shd w:val="clear" w:color="auto" w:fill="FDE9D9" w:themeFill="accent6" w:themeFillTint="33"/>
+          </w:tcPr>
+          <w:p>
+            <w:pPr>
+              <w:rPr>
+                <w:rFonts w:eastAsia="Calibri"/>
+                <w:bCs/>
+                <w:color w:val="000000" w:themeColor="text1"/>
+              </w:rPr>
+            </w:pPr>
+            <w:r>
+              <w:rPr>
+                <w:rFonts w:eastAsia="Calibri"/>
+                <w:b w:val="0"/>
+                <w:color w:val="000000" w:themeColor="text1"/>
+              </w:rPr>
+              <w:t>Opción c)</w:t>
+            </w:r>
+          </w:p>
+        </w:tc>
+        <w:tc>
+          <w:tcPr>
+            <w:tcW w:w="5512" w:type="dxa"/>
+            <w:gridSpan w:val="4"/>
+            <w:shd w:val="clear" w:color="auto" w:fill="FFFFFF" w:themeFill="background1"/>
+          </w:tcPr>
+          <w:p>
+            <w:pPr>
+              <w:jc w:val="both"/>
+              <w:cnfStyle w:val="000000000000" w:firstRow="0" w:lastRow="0" w:firstColumn="0" w:lastColumn="0" w:oddVBand="0" w:evenVBand="0" w:oddHBand="0" w:evenHBand="0" w:firstRowFirstColumn="0" w:firstRowLastColumn="0" w:lastRowFirstColumn="0" w:lastRowLastColumn="0"/>
+              <w:rPr>
+                <w:rFonts w:eastAsia="Calibri"/>
+                <w:b/>
+                <w:bCs/>
+                <w:color w:val="000000" w:themeColor="text1"/>
+              </w:rPr>
+            </w:pPr>
+            <w:r>
+              <w:rPr>
+                <w:b/>
+                <w:bCs/>
+                <w:color w:val="000000" w:themeColor="text1"/>
+              </w:rPr>
+              <w:t>Respaldar cada registro con evidencia verificable y trazable del proceso contable.</w:t>
+            </w:r>
+          </w:p>
+        </w:tc>
+        <w:tc>
+          <w:tcPr>
+            <w:tcW w:w="2108" w:type="dxa"/>
+            <w:shd w:val="clear" w:color="auto" w:fill="FFFFFF" w:themeFill="background1"/>
+          </w:tcPr>
+          <w:p>
+            <w:pPr>
+              <w:cnfStyle w:val="000000000000" w:firstRow="0" w:lastRow="0" w:firstColumn="0" w:lastColumn="0" w:oddVBand="0" w:evenVBand="0" w:oddHBand="0" w:evenHBand="0" w:firstRowFirstColumn="0" w:firstRowLastColumn="0" w:lastRowFirstColumn="0" w:lastRowLastColumn="0"/>
+              <w:rPr>
+                <w:rFonts w:eastAsia="Calibri"/>
+                <w:b/>
+                <w:bCs/>
+                <w:color w:val="000000" w:themeColor="text1"/>
+              </w:rPr>
+            </w:pPr>
+            <w:r>
+              <w:rPr>
+                <w:rFonts w:eastAsia="Calibri"/>
+                <w:b/>
+                <w:bCs/>
                 <w:color w:val="000000" w:themeColor="text1"/>
               </w:rPr>
               <w:t>X</w:t>
             </w:r>
+          </w:p>
+        </w:tc>
+      </w:tr>
+      <w:tr>
+        <w:trPr>
+          <w:cnfStyle w:val="000000100000" w:firstRow="0" w:lastRow="0" w:firstColumn="0" w:lastColumn="0" w:oddVBand="0" w:evenVBand="0" w:oddHBand="1" w:evenHBand="0" w:firstRowFirstColumn="0" w:firstRowLastColumn="0" w:lastRowFirstColumn="0" w:lastRowLastColumn="0"/>
+          <w:trHeight w:val="220"/>
+        </w:trPr>
+        <w:tc>
+          <w:tcPr>
+            <w:cnfStyle w:val="001000000000" w:firstRow="0" w:lastRow="0" w:firstColumn="1" w:lastColumn="0" w:oddVBand="0" w:evenVBand="0" w:oddHBand="0" w:evenHBand="0" w:firstRowFirstColumn="0" w:firstRowLastColumn="0" w:lastRowFirstColumn="0" w:lastRowLastColumn="0"/>
+            <w:tcW w:w="2534" w:type="dxa"/>
+            <w:gridSpan w:val="2"/>
+            <w:shd w:val="clear" w:color="auto" w:fill="FDE9D9" w:themeFill="accent6" w:themeFillTint="33"/>
+          </w:tcPr>
+          <w:p>
+            <w:pPr>
+              <w:rPr>
+                <w:rFonts w:eastAsia="Calibri"/>
+                <w:bCs/>
+                <w:color w:val="000000" w:themeColor="text1"/>
+              </w:rPr>
+            </w:pPr>
+            <w:r>
+              <w:rPr>
+                <w:rFonts w:eastAsia="Calibri"/>
+                <w:b w:val="0"/>
+                <w:color w:val="000000" w:themeColor="text1"/>
+              </w:rPr>
+              <w:t>Opción d)</w:t>
+            </w:r>
+          </w:p>
+        </w:tc>
+        <w:tc>
+          <w:tcPr>
+            <w:tcW w:w="5512" w:type="dxa"/>
+            <w:gridSpan w:val="4"/>
+            <w:shd w:val="clear" w:color="auto" w:fill="FFFFFF" w:themeFill="background1"/>
+          </w:tcPr>
+          <w:p>
+            <w:pPr>
+              <w:jc w:val="both"/>
+              <w:cnfStyle w:val="000000100000" w:firstRow="0" w:lastRow="0" w:firstColumn="0" w:lastColumn="0" w:oddVBand="0" w:evenVBand="0" w:oddHBand="1" w:evenHBand="0" w:firstRowFirstColumn="0" w:firstRowLastColumn="0" w:lastRowFirstColumn="0" w:lastRowLastColumn="0"/>
+              <w:rPr>
+                <w:rFonts w:eastAsia="Calibri"/>
+                <w:bCs/>
+                <w:color w:val="000000" w:themeColor="text1"/>
+              </w:rPr>
+            </w:pPr>
+            <w:r>
+              <w:rPr>
+                <w:color w:val="000000" w:themeColor="text1"/>
+              </w:rPr>
+              <w:t>Reducir el uso de documentos físicos en procesos administrativos internos.</w:t>
+            </w:r>
+          </w:p>
+        </w:tc>
+        <w:tc>
+          <w:tcPr>
+            <w:tcW w:w="2108" w:type="dxa"/>
+            <w:shd w:val="clear" w:color="auto" w:fill="FFFFFF" w:themeFill="background1"/>
+          </w:tcPr>
+          <w:p>
+            <w:pPr>
+              <w:cnfStyle w:val="000000100000" w:firstRow="0" w:lastRow="0" w:firstColumn="0" w:lastColumn="0" w:oddVBand="0" w:evenVBand="0" w:oddHBand="1" w:evenHBand="0" w:firstRowFirstColumn="0" w:firstRowLastColumn="0" w:lastRowFirstColumn="0" w:lastRowLastColumn="0"/>
+              <w:rPr>
+                <w:rFonts w:eastAsia="Calibri"/>
+                <w:bCs/>
+                <w:color w:val="000000" w:themeColor="text1"/>
+              </w:rPr>
+            </w:pPr>
           </w:p>
         </w:tc>
       </w:tr>
@@ -9220,16 +9903,17 @@
               <w:rPr>
                 <w:rFonts w:eastAsia="Calibri"/>
                 <w:b/>
-                <w:color w:val="000000" w:themeColor="text1"/>
-              </w:rPr>
-            </w:pPr>
-            <w:r>
-              <w:rPr>
-                <w:rFonts w:eastAsia="Calibri"/>
-                <w:b/>
-                <w:color w:val="000000" w:themeColor="text1"/>
-              </w:rPr>
-              <w:t>En la Cuenta T, el nombre de la cuenta se escribe siempre en la parte inferior.</w:t>
+                <w:bCs/>
+                <w:color w:val="000000" w:themeColor="text1"/>
+              </w:rPr>
+            </w:pPr>
+            <w:r>
+              <w:rPr>
+                <w:b/>
+                <w:bCs/>
+                <w:color w:val="000000" w:themeColor="text1"/>
+              </w:rPr>
+              <w:t>¿Qué sucede si una transacción no tiene soporte contable válido?</w:t>
             </w:r>
           </w:p>
         </w:tc>
@@ -9248,6 +9932,7 @@
                 <w:lang w:val="pt-PT"/>
               </w:rPr>
             </w:pPr>
+            <w:proofErr w:type="spellStart"/>
             <w:r>
               <w:rPr>
                 <w:rFonts w:eastAsia="Calibri"/>
@@ -9256,7 +9941,40 @@
                 <w:color w:val="000000" w:themeColor="text1"/>
                 <w:lang w:val="pt-PT"/>
               </w:rPr>
-              <w:t>Rta(s) correcta(s) (x)</w:t>
+              <w:t>Rta</w:t>
+            </w:r>
+            <w:proofErr w:type="spellEnd"/>
+            <w:r>
+              <w:rPr>
+                <w:rFonts w:eastAsia="Calibri"/>
+                <w:b/>
+                <w:bCs/>
+                <w:color w:val="000000" w:themeColor="text1"/>
+                <w:lang w:val="pt-PT"/>
+              </w:rPr>
+              <w:t xml:space="preserve">(s) </w:t>
+            </w:r>
+            <w:proofErr w:type="spellStart"/>
+            <w:r>
+              <w:rPr>
+                <w:rFonts w:eastAsia="Calibri"/>
+                <w:b/>
+                <w:bCs/>
+                <w:color w:val="000000" w:themeColor="text1"/>
+                <w:lang w:val="pt-PT"/>
+              </w:rPr>
+              <w:t>correcta</w:t>
+            </w:r>
+            <w:proofErr w:type="spellEnd"/>
+            <w:r>
+              <w:rPr>
+                <w:rFonts w:eastAsia="Calibri"/>
+                <w:b/>
+                <w:bCs/>
+                <w:color w:val="000000" w:themeColor="text1"/>
+                <w:lang w:val="pt-PT"/>
+              </w:rPr>
+              <w:t>(s) (x)</w:t>
             </w:r>
           </w:p>
         </w:tc>
@@ -9300,21 +10018,22 @@
           </w:tcPr>
           <w:p>
             <w:pPr>
+              <w:jc w:val="both"/>
               <w:cnfStyle w:val="000000100000" w:firstRow="0" w:lastRow="0" w:firstColumn="0" w:lastColumn="0" w:oddVBand="0" w:evenVBand="0" w:oddHBand="1" w:evenHBand="0" w:firstRowFirstColumn="0" w:firstRowLastColumn="0" w:lastRowFirstColumn="0" w:lastRowLastColumn="0"/>
               <w:rPr>
                 <w:rFonts w:eastAsia="Calibri"/>
                 <w:b/>
-                <w:color w:val="000000" w:themeColor="text1"/>
-              </w:rPr>
-            </w:pPr>
-            <w:r>
-              <w:rPr>
-                <w:rFonts w:eastAsia="Calibri"/>
-                <w:b/>
-                <w:iCs/>
-                <w:color w:val="000000" w:themeColor="text1"/>
-              </w:rPr>
-              <w:t>Falso.</w:t>
+                <w:bCs/>
+                <w:color w:val="000000" w:themeColor="text1"/>
+              </w:rPr>
+            </w:pPr>
+            <w:r>
+              <w:rPr>
+                <w:b/>
+                <w:bCs/>
+                <w:color w:val="000000" w:themeColor="text1"/>
+              </w:rPr>
+              <w:t>El registro pierde validez y no puede considerarse confiable dentro del sistema contable.</w:t>
             </w:r>
           </w:p>
         </w:tc>
@@ -9328,14 +10047,16 @@
               <w:cnfStyle w:val="000000100000" w:firstRow="0" w:lastRow="0" w:firstColumn="0" w:lastColumn="0" w:oddVBand="0" w:evenVBand="0" w:oddHBand="1" w:evenHBand="0" w:firstRowFirstColumn="0" w:firstRowLastColumn="0" w:lastRowFirstColumn="0" w:lastRowLastColumn="0"/>
               <w:rPr>
                 <w:rFonts w:eastAsia="Calibri"/>
-                <w:bCs/>
-                <w:color w:val="000000" w:themeColor="text1"/>
-              </w:rPr>
-            </w:pPr>
-            <w:r>
-              <w:rPr>
-                <w:rFonts w:eastAsia="Calibri"/>
-                <w:b/>
+                <w:b/>
+                <w:bCs/>
+                <w:color w:val="000000" w:themeColor="text1"/>
+              </w:rPr>
+            </w:pPr>
+            <w:r>
+              <w:rPr>
+                <w:rFonts w:eastAsia="Calibri"/>
+                <w:b/>
+                <w:bCs/>
                 <w:color w:val="000000" w:themeColor="text1"/>
               </w:rPr>
               <w:t>X</w:t>
@@ -9381,6 +10102,7 @@
           </w:tcPr>
           <w:p>
             <w:pPr>
+              <w:jc w:val="both"/>
               <w:cnfStyle w:val="000000000000" w:firstRow="0" w:lastRow="0" w:firstColumn="0" w:lastColumn="0" w:oddVBand="0" w:evenVBand="0" w:oddHBand="0" w:evenHBand="0" w:firstRowFirstColumn="0" w:firstRowLastColumn="0" w:lastRowFirstColumn="0" w:lastRowLastColumn="0"/>
               <w:rPr>
                 <w:rFonts w:eastAsia="Calibri"/>
@@ -9390,12 +10112,9 @@
             </w:pPr>
             <w:r>
               <w:rPr>
-                <w:rFonts w:eastAsia="Calibri"/>
-                <w:bCs/>
-                <w:iCs/>
-                <w:color w:val="000000" w:themeColor="text1"/>
-              </w:rPr>
-              <w:t xml:space="preserve">Verdadero. </w:t>
+                <w:color w:val="000000" w:themeColor="text1"/>
+              </w:rPr>
+              <w:t>Se puede registrar igualmente si existe conocimiento previo del hecho económico.</w:t>
             </w:r>
           </w:p>
         </w:tc>
@@ -9410,6 +10129,147 @@
               <w:rPr>
                 <w:rFonts w:eastAsia="Calibri"/>
                 <w:b/>
+                <w:color w:val="000000" w:themeColor="text1"/>
+              </w:rPr>
+            </w:pPr>
+          </w:p>
+        </w:tc>
+      </w:tr>
+      <w:tr>
+        <w:trPr>
+          <w:cnfStyle w:val="000000100000" w:firstRow="0" w:lastRow="0" w:firstColumn="0" w:lastColumn="0" w:oddVBand="0" w:evenVBand="0" w:oddHBand="1" w:evenHBand="0" w:firstRowFirstColumn="0" w:firstRowLastColumn="0" w:lastRowFirstColumn="0" w:lastRowLastColumn="0"/>
+          <w:trHeight w:val="220"/>
+        </w:trPr>
+        <w:tc>
+          <w:tcPr>
+            <w:cnfStyle w:val="001000000000" w:firstRow="0" w:lastRow="0" w:firstColumn="1" w:lastColumn="0" w:oddVBand="0" w:evenVBand="0" w:oddHBand="0" w:evenHBand="0" w:firstRowFirstColumn="0" w:firstRowLastColumn="0" w:lastRowFirstColumn="0" w:lastRowLastColumn="0"/>
+            <w:tcW w:w="2534" w:type="dxa"/>
+            <w:gridSpan w:val="2"/>
+            <w:shd w:val="clear" w:color="auto" w:fill="FDE9D9" w:themeFill="accent6" w:themeFillTint="33"/>
+          </w:tcPr>
+          <w:p>
+            <w:pPr>
+              <w:rPr>
+                <w:rFonts w:eastAsia="Calibri"/>
+                <w:bCs/>
+                <w:color w:val="000000" w:themeColor="text1"/>
+              </w:rPr>
+            </w:pPr>
+            <w:r>
+              <w:rPr>
+                <w:rFonts w:eastAsia="Calibri"/>
+                <w:b w:val="0"/>
+                <w:color w:val="000000" w:themeColor="text1"/>
+              </w:rPr>
+              <w:t>Opción c)</w:t>
+            </w:r>
+          </w:p>
+        </w:tc>
+        <w:tc>
+          <w:tcPr>
+            <w:tcW w:w="5512" w:type="dxa"/>
+            <w:gridSpan w:val="4"/>
+            <w:shd w:val="clear" w:color="auto" w:fill="FFFFFF" w:themeFill="background1"/>
+          </w:tcPr>
+          <w:p>
+            <w:pPr>
+              <w:jc w:val="both"/>
+              <w:cnfStyle w:val="000000100000" w:firstRow="0" w:lastRow="0" w:firstColumn="0" w:lastColumn="0" w:oddVBand="0" w:evenVBand="0" w:oddHBand="1" w:evenHBand="0" w:firstRowFirstColumn="0" w:firstRowLastColumn="0" w:lastRowFirstColumn="0" w:lastRowLastColumn="0"/>
+              <w:rPr>
+                <w:rFonts w:eastAsia="Calibri"/>
+                <w:bCs/>
+                <w:color w:val="000000" w:themeColor="text1"/>
+              </w:rPr>
+            </w:pPr>
+            <w:r>
+              <w:rPr>
+                <w:color w:val="000000" w:themeColor="text1"/>
+              </w:rPr>
+              <w:t>Solo afecta el resultado del periodo sin alterar otros registros contables.</w:t>
+            </w:r>
+          </w:p>
+        </w:tc>
+        <w:tc>
+          <w:tcPr>
+            <w:tcW w:w="2108" w:type="dxa"/>
+            <w:shd w:val="clear" w:color="auto" w:fill="FFFFFF" w:themeFill="background1"/>
+          </w:tcPr>
+          <w:p>
+            <w:pPr>
+              <w:cnfStyle w:val="000000100000" w:firstRow="0" w:lastRow="0" w:firstColumn="0" w:lastColumn="0" w:oddVBand="0" w:evenVBand="0" w:oddHBand="1" w:evenHBand="0" w:firstRowFirstColumn="0" w:firstRowLastColumn="0" w:lastRowFirstColumn="0" w:lastRowLastColumn="0"/>
+              <w:rPr>
+                <w:rFonts w:eastAsia="Calibri"/>
+                <w:bCs/>
+                <w:color w:val="000000" w:themeColor="text1"/>
+              </w:rPr>
+            </w:pPr>
+          </w:p>
+        </w:tc>
+      </w:tr>
+      <w:tr>
+        <w:trPr>
+          <w:trHeight w:val="220"/>
+        </w:trPr>
+        <w:tc>
+          <w:tcPr>
+            <w:cnfStyle w:val="001000000000" w:firstRow="0" w:lastRow="0" w:firstColumn="1" w:lastColumn="0" w:oddVBand="0" w:evenVBand="0" w:oddHBand="0" w:evenHBand="0" w:firstRowFirstColumn="0" w:firstRowLastColumn="0" w:lastRowFirstColumn="0" w:lastRowLastColumn="0"/>
+            <w:tcW w:w="2534" w:type="dxa"/>
+            <w:gridSpan w:val="2"/>
+            <w:shd w:val="clear" w:color="auto" w:fill="FDE9D9" w:themeFill="accent6" w:themeFillTint="33"/>
+          </w:tcPr>
+          <w:p>
+            <w:pPr>
+              <w:rPr>
+                <w:rFonts w:eastAsia="Calibri"/>
+                <w:bCs/>
+                <w:color w:val="000000" w:themeColor="text1"/>
+              </w:rPr>
+            </w:pPr>
+            <w:r>
+              <w:rPr>
+                <w:rFonts w:eastAsia="Calibri"/>
+                <w:b w:val="0"/>
+                <w:color w:val="000000" w:themeColor="text1"/>
+              </w:rPr>
+              <w:t>Opción d)</w:t>
+            </w:r>
+          </w:p>
+        </w:tc>
+        <w:tc>
+          <w:tcPr>
+            <w:tcW w:w="5512" w:type="dxa"/>
+            <w:gridSpan w:val="4"/>
+            <w:shd w:val="clear" w:color="auto" w:fill="FFFFFF" w:themeFill="background1"/>
+          </w:tcPr>
+          <w:p>
+            <w:pPr>
+              <w:jc w:val="both"/>
+              <w:cnfStyle w:val="000000000000" w:firstRow="0" w:lastRow="0" w:firstColumn="0" w:lastColumn="0" w:oddVBand="0" w:evenVBand="0" w:oddHBand="0" w:evenHBand="0" w:firstRowFirstColumn="0" w:firstRowLastColumn="0" w:lastRowFirstColumn="0" w:lastRowLastColumn="0"/>
+              <w:rPr>
+                <w:rFonts w:eastAsia="Calibri"/>
+                <w:bCs/>
+                <w:color w:val="000000" w:themeColor="text1"/>
+              </w:rPr>
+            </w:pPr>
+            <w:r>
+              <w:rPr>
+                <w:color w:val="000000" w:themeColor="text1"/>
+              </w:rPr>
+              <w:t>No tiene impacto si el valor registrado coincide con el saldo esperado.</w:t>
+            </w:r>
+          </w:p>
+        </w:tc>
+        <w:tc>
+          <w:tcPr>
+            <w:tcW w:w="2108" w:type="dxa"/>
+            <w:shd w:val="clear" w:color="auto" w:fill="FFFFFF" w:themeFill="background1"/>
+          </w:tcPr>
+          <w:p>
+            <w:pPr>
+              <w:cnfStyle w:val="000000000000" w:firstRow="0" w:lastRow="0" w:firstColumn="0" w:lastColumn="0" w:oddVBand="0" w:evenVBand="0" w:oddHBand="0" w:evenHBand="0" w:firstRowFirstColumn="0" w:firstRowLastColumn="0" w:lastRowFirstColumn="0" w:lastRowLastColumn="0"/>
+              <w:rPr>
+                <w:rFonts w:eastAsia="Calibri"/>
+                <w:bCs/>
                 <w:color w:val="000000" w:themeColor="text1"/>
               </w:rPr>
             </w:pPr>
@@ -9570,18 +10430,18 @@
               <w:rPr>
                 <w:rFonts w:eastAsia="Calibri"/>
                 <w:b/>
+                <w:bCs/>
                 <w:iCs/>
                 <w:color w:val="000000" w:themeColor="text1"/>
               </w:rPr>
             </w:pPr>
             <w:r>
               <w:rPr>
-                <w:rFonts w:eastAsia="Calibri"/>
-                <w:b/>
-                <w:iCs/>
-                <w:color w:val="000000" w:themeColor="text1"/>
-              </w:rPr>
-              <w:t>Las cuentas de Patrimonio son de naturaleza crédito, es decir, aumentan en el Haber.</w:t>
+                <w:b/>
+                <w:bCs/>
+                <w:color w:val="000000" w:themeColor="text1"/>
+              </w:rPr>
+              <w:t>¿Cuál es el propósito principal de la etapa de verificación en el ciclo contable?</w:t>
             </w:r>
           </w:p>
         </w:tc>
@@ -9602,6 +10462,7 @@
                 <w:lang w:val="pt-PT"/>
               </w:rPr>
             </w:pPr>
+            <w:proofErr w:type="spellStart"/>
             <w:r>
               <w:rPr>
                 <w:rFonts w:eastAsia="Calibri"/>
@@ -9610,7 +10471,40 @@
                 <w:color w:val="000000" w:themeColor="text1"/>
                 <w:lang w:val="pt-PT"/>
               </w:rPr>
-              <w:t>Rta(s) correcta(s) (x)</w:t>
+              <w:t>Rta</w:t>
+            </w:r>
+            <w:proofErr w:type="spellEnd"/>
+            <w:r>
+              <w:rPr>
+                <w:rFonts w:eastAsia="Calibri"/>
+                <w:b/>
+                <w:bCs/>
+                <w:color w:val="000000" w:themeColor="text1"/>
+                <w:lang w:val="pt-PT"/>
+              </w:rPr>
+              <w:t xml:space="preserve">(s) </w:t>
+            </w:r>
+            <w:proofErr w:type="spellStart"/>
+            <w:r>
+              <w:rPr>
+                <w:rFonts w:eastAsia="Calibri"/>
+                <w:b/>
+                <w:bCs/>
+                <w:color w:val="000000" w:themeColor="text1"/>
+                <w:lang w:val="pt-PT"/>
+              </w:rPr>
+              <w:t>correcta</w:t>
+            </w:r>
+            <w:proofErr w:type="spellEnd"/>
+            <w:r>
+              <w:rPr>
+                <w:rFonts w:eastAsia="Calibri"/>
+                <w:b/>
+                <w:bCs/>
+                <w:color w:val="000000" w:themeColor="text1"/>
+                <w:lang w:val="pt-PT"/>
+              </w:rPr>
+              <w:t>(s) (x)</w:t>
             </w:r>
           </w:p>
         </w:tc>
@@ -9655,6 +10549,7 @@
           </w:tcPr>
           <w:p>
             <w:pPr>
+              <w:jc w:val="both"/>
               <w:cnfStyle w:val="000000000000" w:firstRow="0" w:lastRow="0" w:firstColumn="0" w:lastColumn="0" w:oddVBand="0" w:evenVBand="0" w:oddHBand="0" w:evenHBand="0" w:firstRowFirstColumn="0" w:firstRowLastColumn="0" w:lastRowFirstColumn="0" w:lastRowLastColumn="0"/>
               <w:rPr>
                 <w:rFonts w:eastAsia="Calibri"/>
@@ -9665,12 +10560,9 @@
             </w:pPr>
             <w:r>
               <w:rPr>
-                <w:rFonts w:eastAsia="Calibri"/>
-                <w:bCs/>
-                <w:iCs/>
-                <w:color w:val="000000" w:themeColor="text1"/>
-              </w:rPr>
-              <w:t>Falso.</w:t>
+                <w:color w:val="000000" w:themeColor="text1"/>
+              </w:rPr>
+              <w:t>Registrar las transacciones iniciales según los documentos soporte disponibles.</w:t>
             </w:r>
           </w:p>
         </w:tc>
@@ -9736,22 +10628,21 @@
           </w:tcPr>
           <w:p>
             <w:pPr>
+              <w:jc w:val="both"/>
               <w:cnfStyle w:val="000000100000" w:firstRow="0" w:lastRow="0" w:firstColumn="0" w:lastColumn="0" w:oddVBand="0" w:evenVBand="0" w:oddHBand="1" w:evenHBand="0" w:firstRowFirstColumn="0" w:firstRowLastColumn="0" w:lastRowFirstColumn="0" w:lastRowLastColumn="0"/>
               <w:rPr>
                 <w:rFonts w:eastAsia="Calibri"/>
                 <w:b/>
+                <w:bCs/>
                 <w:iCs/>
                 <w:color w:val="000000" w:themeColor="text1"/>
               </w:rPr>
             </w:pPr>
             <w:r>
               <w:rPr>
-                <w:rFonts w:eastAsia="Calibri"/>
-                <w:b/>
-                <w:iCs/>
-                <w:color w:val="000000" w:themeColor="text1"/>
-              </w:rPr>
-              <w:t xml:space="preserve">Verdadero. </w:t>
+                <w:color w:val="000000" w:themeColor="text1"/>
+              </w:rPr>
+              <w:t>Clasificar las cuentas según su naturaleza dentro del plan contable definido.</w:t>
             </w:r>
           </w:p>
         </w:tc>
@@ -9768,16 +10659,160 @@
               <w:cnfStyle w:val="000000100000" w:firstRow="0" w:lastRow="0" w:firstColumn="0" w:lastColumn="0" w:oddVBand="0" w:evenVBand="0" w:oddHBand="1" w:evenHBand="0" w:firstRowFirstColumn="0" w:firstRowLastColumn="0" w:lastRowFirstColumn="0" w:lastRowLastColumn="0"/>
               <w:rPr>
                 <w:rFonts w:eastAsia="Calibri"/>
+                <w:b/>
                 <w:bCs/>
                 <w:iCs/>
                 <w:color w:val="000000" w:themeColor="text1"/>
               </w:rPr>
             </w:pPr>
-            <w:r>
-              <w:rPr>
-                <w:rFonts w:eastAsia="Calibri"/>
-                <w:b/>
-                <w:iCs/>
+          </w:p>
+        </w:tc>
+      </w:tr>
+      <w:tr>
+        <w:trPr>
+          <w:trHeight w:val="220"/>
+        </w:trPr>
+        <w:tc>
+          <w:tcPr>
+            <w:cnfStyle w:val="001000000000" w:firstRow="0" w:lastRow="0" w:firstColumn="1" w:lastColumn="0" w:oddVBand="0" w:evenVBand="0" w:oddHBand="0" w:evenHBand="0" w:firstRowFirstColumn="0" w:firstRowLastColumn="0" w:lastRowFirstColumn="0" w:lastRowLastColumn="0"/>
+            <w:tcW w:w="2534" w:type="dxa"/>
+            <w:gridSpan w:val="2"/>
+            <w:shd w:val="clear" w:color="auto" w:fill="FDE9D9" w:themeFill="accent6" w:themeFillTint="33"/>
+          </w:tcPr>
+          <w:p>
+            <w:pPr>
+              <w:rPr>
+                <w:rFonts w:eastAsia="Calibri"/>
+                <w:bCs/>
+                <w:color w:val="000000" w:themeColor="text1"/>
+              </w:rPr>
+            </w:pPr>
+            <w:r>
+              <w:rPr>
+                <w:rFonts w:eastAsia="Calibri"/>
+                <w:b w:val="0"/>
+                <w:color w:val="000000" w:themeColor="text1"/>
+              </w:rPr>
+              <w:t>Opción c)</w:t>
+            </w:r>
+          </w:p>
+        </w:tc>
+        <w:tc>
+          <w:tcPr>
+            <w:tcW w:w="5512" w:type="dxa"/>
+            <w:gridSpan w:val="4"/>
+            <w:shd w:val="clear" w:color="auto" w:fill="FFFFFF" w:themeFill="background1"/>
+          </w:tcPr>
+          <w:p>
+            <w:pPr>
+              <w:jc w:val="both"/>
+              <w:cnfStyle w:val="000000000000" w:firstRow="0" w:lastRow="0" w:firstColumn="0" w:lastColumn="0" w:oddVBand="0" w:evenVBand="0" w:oddHBand="0" w:evenHBand="0" w:firstRowFirstColumn="0" w:firstRowLastColumn="0" w:lastRowFirstColumn="0" w:lastRowLastColumn="0"/>
+              <w:rPr>
+                <w:rFonts w:eastAsia="Calibri"/>
+                <w:bCs/>
+                <w:color w:val="000000" w:themeColor="text1"/>
+              </w:rPr>
+            </w:pPr>
+            <w:r>
+              <w:rPr>
+                <w:color w:val="000000" w:themeColor="text1"/>
+              </w:rPr>
+              <w:t>Identificar los hechos económicos antes de iniciar el registro contable formal.</w:t>
+            </w:r>
+          </w:p>
+        </w:tc>
+        <w:tc>
+          <w:tcPr>
+            <w:tcW w:w="2108" w:type="dxa"/>
+            <w:shd w:val="clear" w:color="auto" w:fill="FFFFFF" w:themeFill="background1"/>
+          </w:tcPr>
+          <w:p>
+            <w:pPr>
+              <w:cnfStyle w:val="000000000000" w:firstRow="0" w:lastRow="0" w:firstColumn="0" w:lastColumn="0" w:oddVBand="0" w:evenVBand="0" w:oddHBand="0" w:evenHBand="0" w:firstRowFirstColumn="0" w:firstRowLastColumn="0" w:lastRowFirstColumn="0" w:lastRowLastColumn="0"/>
+              <w:rPr>
+                <w:rFonts w:eastAsia="Calibri"/>
+                <w:bCs/>
+                <w:color w:val="000000" w:themeColor="text1"/>
+              </w:rPr>
+            </w:pPr>
+          </w:p>
+        </w:tc>
+      </w:tr>
+      <w:tr>
+        <w:trPr>
+          <w:cnfStyle w:val="000000100000" w:firstRow="0" w:lastRow="0" w:firstColumn="0" w:lastColumn="0" w:oddVBand="0" w:evenVBand="0" w:oddHBand="1" w:evenHBand="0" w:firstRowFirstColumn="0" w:firstRowLastColumn="0" w:lastRowFirstColumn="0" w:lastRowLastColumn="0"/>
+          <w:trHeight w:val="220"/>
+        </w:trPr>
+        <w:tc>
+          <w:tcPr>
+            <w:cnfStyle w:val="001000000000" w:firstRow="0" w:lastRow="0" w:firstColumn="1" w:lastColumn="0" w:oddVBand="0" w:evenVBand="0" w:oddHBand="0" w:evenHBand="0" w:firstRowFirstColumn="0" w:firstRowLastColumn="0" w:lastRowFirstColumn="0" w:lastRowLastColumn="0"/>
+            <w:tcW w:w="2534" w:type="dxa"/>
+            <w:gridSpan w:val="2"/>
+            <w:shd w:val="clear" w:color="auto" w:fill="FDE9D9" w:themeFill="accent6" w:themeFillTint="33"/>
+          </w:tcPr>
+          <w:p>
+            <w:pPr>
+              <w:rPr>
+                <w:rFonts w:eastAsia="Calibri"/>
+                <w:bCs/>
+                <w:color w:val="000000" w:themeColor="text1"/>
+              </w:rPr>
+            </w:pPr>
+            <w:r>
+              <w:rPr>
+                <w:rFonts w:eastAsia="Calibri"/>
+                <w:b w:val="0"/>
+                <w:color w:val="000000" w:themeColor="text1"/>
+              </w:rPr>
+              <w:t>Opción d)</w:t>
+            </w:r>
+          </w:p>
+        </w:tc>
+        <w:tc>
+          <w:tcPr>
+            <w:tcW w:w="5512" w:type="dxa"/>
+            <w:gridSpan w:val="4"/>
+            <w:shd w:val="clear" w:color="auto" w:fill="FFFFFF" w:themeFill="background1"/>
+          </w:tcPr>
+          <w:p>
+            <w:pPr>
+              <w:jc w:val="both"/>
+              <w:cnfStyle w:val="000000100000" w:firstRow="0" w:lastRow="0" w:firstColumn="0" w:lastColumn="0" w:oddVBand="0" w:evenVBand="0" w:oddHBand="1" w:evenHBand="0" w:firstRowFirstColumn="0" w:firstRowLastColumn="0" w:lastRowFirstColumn="0" w:lastRowLastColumn="0"/>
+              <w:rPr>
+                <w:rFonts w:eastAsia="Calibri"/>
+                <w:b/>
+                <w:bCs/>
+                <w:color w:val="000000" w:themeColor="text1"/>
+              </w:rPr>
+            </w:pPr>
+            <w:r>
+              <w:rPr>
+                <w:b/>
+                <w:bCs/>
+                <w:color w:val="000000" w:themeColor="text1"/>
+              </w:rPr>
+              <w:t>Revisar coherencia de saldos y realizar ajustes necesarios en registros contables.</w:t>
+            </w:r>
+          </w:p>
+        </w:tc>
+        <w:tc>
+          <w:tcPr>
+            <w:tcW w:w="2108" w:type="dxa"/>
+            <w:shd w:val="clear" w:color="auto" w:fill="FFFFFF" w:themeFill="background1"/>
+          </w:tcPr>
+          <w:p>
+            <w:pPr>
+              <w:cnfStyle w:val="000000100000" w:firstRow="0" w:lastRow="0" w:firstColumn="0" w:lastColumn="0" w:oddVBand="0" w:evenVBand="0" w:oddHBand="1" w:evenHBand="0" w:firstRowFirstColumn="0" w:firstRowLastColumn="0" w:lastRowFirstColumn="0" w:lastRowLastColumn="0"/>
+              <w:rPr>
+                <w:rFonts w:eastAsia="Calibri"/>
+                <w:b/>
+                <w:color w:val="000000" w:themeColor="text1"/>
+              </w:rPr>
+            </w:pPr>
+            <w:r>
+              <w:rPr>
+                <w:rFonts w:eastAsia="Calibri"/>
+                <w:b/>
                 <w:color w:val="000000" w:themeColor="text1"/>
               </w:rPr>
               <w:t>X</w:t>
@@ -9945,11 +10980,11 @@
             </w:pPr>
             <w:r>
               <w:rPr>
-                <w:rFonts w:eastAsia="Calibri"/>
-                <w:b/>
-                <w:color w:val="000000" w:themeColor="text1"/>
-              </w:rPr>
-              <w:t>El ciclo contable es un proceso que ocurre una sola vez en la vida de la empresa.</w:t>
+                <w:b/>
+                <w:bCs/>
+                <w:color w:val="000000" w:themeColor="text1"/>
+              </w:rPr>
+              <w:t>¿Qué indica un saldo deudor en una cuenta contable al finalizar el periodo?</w:t>
             </w:r>
           </w:p>
         </w:tc>
@@ -9969,6 +11004,7 @@
                 <w:lang w:val="pt-PT"/>
               </w:rPr>
             </w:pPr>
+            <w:proofErr w:type="spellStart"/>
             <w:r>
               <w:rPr>
                 <w:rFonts w:eastAsia="Calibri"/>
@@ -9977,7 +11013,40 @@
                 <w:color w:val="000000" w:themeColor="text1"/>
                 <w:lang w:val="pt-PT"/>
               </w:rPr>
-              <w:t>Rta(s) correcta(s) (x)</w:t>
+              <w:t>Rta</w:t>
+            </w:r>
+            <w:proofErr w:type="spellEnd"/>
+            <w:r>
+              <w:rPr>
+                <w:rFonts w:eastAsia="Calibri"/>
+                <w:b/>
+                <w:bCs/>
+                <w:color w:val="000000" w:themeColor="text1"/>
+                <w:lang w:val="pt-PT"/>
+              </w:rPr>
+              <w:t xml:space="preserve">(s) </w:t>
+            </w:r>
+            <w:proofErr w:type="spellStart"/>
+            <w:r>
+              <w:rPr>
+                <w:rFonts w:eastAsia="Calibri"/>
+                <w:b/>
+                <w:bCs/>
+                <w:color w:val="000000" w:themeColor="text1"/>
+                <w:lang w:val="pt-PT"/>
+              </w:rPr>
+              <w:t>correcta</w:t>
+            </w:r>
+            <w:proofErr w:type="spellEnd"/>
+            <w:r>
+              <w:rPr>
+                <w:rFonts w:eastAsia="Calibri"/>
+                <w:b/>
+                <w:bCs/>
+                <w:color w:val="000000" w:themeColor="text1"/>
+                <w:lang w:val="pt-PT"/>
+              </w:rPr>
+              <w:t>(s) (x)</w:t>
             </w:r>
           </w:p>
         </w:tc>
@@ -10033,12 +11102,9 @@
             </w:pPr>
             <w:r>
               <w:rPr>
-                <w:rFonts w:eastAsia="Calibri"/>
-                <w:b/>
-                <w:iCs/>
-                <w:color w:val="000000" w:themeColor="text1"/>
-              </w:rPr>
-              <w:t>Falso.</w:t>
+                <w:color w:val="000000" w:themeColor="text1"/>
+              </w:rPr>
+              <w:t>Que el total del haber es mayor que el debe en dicha cuenta contable.</w:t>
             </w:r>
           </w:p>
         </w:tc>
@@ -10060,15 +11126,6 @@
                 <w:color w:val="000000" w:themeColor="text1"/>
               </w:rPr>
             </w:pPr>
-            <w:r>
-              <w:rPr>
-                <w:rFonts w:eastAsia="Calibri"/>
-                <w:b/>
-                <w:iCs/>
-                <w:color w:val="000000" w:themeColor="text1"/>
-              </w:rPr>
-              <w:t>X</w:t>
-            </w:r>
           </w:p>
         </w:tc>
       </w:tr>
@@ -10122,12 +11179,11 @@
             </w:pPr>
             <w:r>
               <w:rPr>
-                <w:rFonts w:eastAsia="Calibri"/>
-                <w:bCs/>
-                <w:iCs/>
-                <w:color w:val="000000" w:themeColor="text1"/>
-              </w:rPr>
-              <w:t xml:space="preserve">Verdadero. </w:t>
+                <w:b/>
+                <w:bCs/>
+                <w:color w:val="000000" w:themeColor="text1"/>
+              </w:rPr>
+              <w:t>Que el total del debe es mayor que el haber en dicha cuenta contable.</w:t>
             </w:r>
           </w:p>
         </w:tc>
@@ -10149,6 +11205,16 @@
                 <w:color w:val="000000" w:themeColor="text1"/>
               </w:rPr>
             </w:pPr>
+            <w:r>
+              <w:rPr>
+                <w:rFonts w:eastAsia="Calibri"/>
+                <w:b/>
+                <w:bCs/>
+                <w:iCs/>
+                <w:color w:val="000000" w:themeColor="text1"/>
+              </w:rPr>
+              <w:t>X</w:t>
+            </w:r>
           </w:p>
         </w:tc>
       </w:tr>
@@ -10176,10 +11242,150 @@
               <w:rPr>
                 <w:rFonts w:eastAsia="Calibri"/>
                 <w:b w:val="0"/>
-                <w:bCs/>
-                <w:color w:val="000000" w:themeColor="text1"/>
-              </w:rPr>
-              <w:lastRenderedPageBreak/>
+                <w:color w:val="000000" w:themeColor="text1"/>
+              </w:rPr>
+              <w:t>Opción c)</w:t>
+            </w:r>
+          </w:p>
+        </w:tc>
+        <w:tc>
+          <w:tcPr>
+            <w:tcW w:w="5512" w:type="dxa"/>
+            <w:gridSpan w:val="4"/>
+            <w:shd w:val="clear" w:color="auto" w:fill="FFFFFF" w:themeFill="background1"/>
+          </w:tcPr>
+          <w:p>
+            <w:pPr>
+              <w:jc w:val="both"/>
+              <w:cnfStyle w:val="000000100000" w:firstRow="0" w:lastRow="0" w:firstColumn="0" w:lastColumn="0" w:oddVBand="0" w:evenVBand="0" w:oddHBand="1" w:evenHBand="0" w:firstRowFirstColumn="0" w:firstRowLastColumn="0" w:lastRowFirstColumn="0" w:lastRowLastColumn="0"/>
+              <w:rPr>
+                <w:rFonts w:eastAsia="Calibri"/>
+                <w:bCs/>
+                <w:color w:val="000000" w:themeColor="text1"/>
+              </w:rPr>
+            </w:pPr>
+            <w:r>
+              <w:rPr>
+                <w:color w:val="000000" w:themeColor="text1"/>
+              </w:rPr>
+              <w:t>Que no existen movimientos registrados durante el periodo contable evaluado.</w:t>
+            </w:r>
+          </w:p>
+        </w:tc>
+        <w:tc>
+          <w:tcPr>
+            <w:tcW w:w="2108" w:type="dxa"/>
+            <w:shd w:val="clear" w:color="auto" w:fill="FFFFFF" w:themeFill="background1"/>
+          </w:tcPr>
+          <w:p>
+            <w:pPr>
+              <w:cnfStyle w:val="000000100000" w:firstRow="0" w:lastRow="0" w:firstColumn="0" w:lastColumn="0" w:oddVBand="0" w:evenVBand="0" w:oddHBand="1" w:evenHBand="0" w:firstRowFirstColumn="0" w:firstRowLastColumn="0" w:lastRowFirstColumn="0" w:lastRowLastColumn="0"/>
+              <w:rPr>
+                <w:rFonts w:eastAsia="Calibri"/>
+                <w:bCs/>
+                <w:color w:val="000000" w:themeColor="text1"/>
+              </w:rPr>
+            </w:pPr>
+          </w:p>
+        </w:tc>
+      </w:tr>
+      <w:tr>
+        <w:trPr>
+          <w:trHeight w:val="220"/>
+        </w:trPr>
+        <w:tc>
+          <w:tcPr>
+            <w:cnfStyle w:val="001000000000" w:firstRow="0" w:lastRow="0" w:firstColumn="1" w:lastColumn="0" w:oddVBand="0" w:evenVBand="0" w:oddHBand="0" w:evenHBand="0" w:firstRowFirstColumn="0" w:firstRowLastColumn="0" w:lastRowFirstColumn="0" w:lastRowLastColumn="0"/>
+            <w:tcW w:w="2534" w:type="dxa"/>
+            <w:gridSpan w:val="2"/>
+            <w:shd w:val="clear" w:color="auto" w:fill="FDE9D9" w:themeFill="accent6" w:themeFillTint="33"/>
+          </w:tcPr>
+          <w:p>
+            <w:pPr>
+              <w:rPr>
+                <w:rFonts w:eastAsia="Calibri"/>
+                <w:bCs/>
+                <w:color w:val="000000" w:themeColor="text1"/>
+              </w:rPr>
+            </w:pPr>
+            <w:r>
+              <w:rPr>
+                <w:rFonts w:eastAsia="Calibri"/>
+                <w:b w:val="0"/>
+                <w:color w:val="000000" w:themeColor="text1"/>
+              </w:rPr>
+              <w:t>Opción d)</w:t>
+            </w:r>
+          </w:p>
+        </w:tc>
+        <w:tc>
+          <w:tcPr>
+            <w:tcW w:w="5512" w:type="dxa"/>
+            <w:gridSpan w:val="4"/>
+            <w:shd w:val="clear" w:color="auto" w:fill="FFFFFF" w:themeFill="background1"/>
+          </w:tcPr>
+          <w:p>
+            <w:pPr>
+              <w:jc w:val="both"/>
+              <w:cnfStyle w:val="000000000000" w:firstRow="0" w:lastRow="0" w:firstColumn="0" w:lastColumn="0" w:oddVBand="0" w:evenVBand="0" w:oddHBand="0" w:evenHBand="0" w:firstRowFirstColumn="0" w:firstRowLastColumn="0" w:lastRowFirstColumn="0" w:lastRowLastColumn="0"/>
+              <w:rPr>
+                <w:rFonts w:eastAsia="Calibri"/>
+                <w:bCs/>
+                <w:color w:val="000000" w:themeColor="text1"/>
+              </w:rPr>
+            </w:pPr>
+            <w:r>
+              <w:rPr>
+                <w:color w:val="000000" w:themeColor="text1"/>
+              </w:rPr>
+              <w:t>Que los valores registrados en ambos lados son exactamente iguales.</w:t>
+            </w:r>
+          </w:p>
+        </w:tc>
+        <w:tc>
+          <w:tcPr>
+            <w:tcW w:w="2108" w:type="dxa"/>
+            <w:shd w:val="clear" w:color="auto" w:fill="FFFFFF" w:themeFill="background1"/>
+          </w:tcPr>
+          <w:p>
+            <w:pPr>
+              <w:cnfStyle w:val="000000000000" w:firstRow="0" w:lastRow="0" w:firstColumn="0" w:lastColumn="0" w:oddVBand="0" w:evenVBand="0" w:oddHBand="0" w:evenHBand="0" w:firstRowFirstColumn="0" w:firstRowLastColumn="0" w:lastRowFirstColumn="0" w:lastRowLastColumn="0"/>
+              <w:rPr>
+                <w:rFonts w:eastAsia="Calibri"/>
+                <w:bCs/>
+                <w:color w:val="000000" w:themeColor="text1"/>
+              </w:rPr>
+            </w:pPr>
+          </w:p>
+        </w:tc>
+      </w:tr>
+      <w:tr>
+        <w:trPr>
+          <w:cnfStyle w:val="000000100000" w:firstRow="0" w:lastRow="0" w:firstColumn="0" w:lastColumn="0" w:oddVBand="0" w:evenVBand="0" w:oddHBand="1" w:evenHBand="0" w:firstRowFirstColumn="0" w:firstRowLastColumn="0" w:lastRowFirstColumn="0" w:lastRowLastColumn="0"/>
+          <w:trHeight w:val="220"/>
+        </w:trPr>
+        <w:tc>
+          <w:tcPr>
+            <w:cnfStyle w:val="001000000000" w:firstRow="0" w:lastRow="0" w:firstColumn="1" w:lastColumn="0" w:oddVBand="0" w:evenVBand="0" w:oddHBand="0" w:evenHBand="0" w:firstRowFirstColumn="0" w:firstRowLastColumn="0" w:lastRowFirstColumn="0" w:lastRowLastColumn="0"/>
+            <w:tcW w:w="2534" w:type="dxa"/>
+            <w:gridSpan w:val="2"/>
+            <w:shd w:val="clear" w:color="auto" w:fill="FDE9D9" w:themeFill="accent6" w:themeFillTint="33"/>
+          </w:tcPr>
+          <w:p>
+            <w:pPr>
+              <w:rPr>
+                <w:rFonts w:eastAsia="Calibri"/>
+                <w:bCs/>
+                <w:color w:val="000000" w:themeColor="text1"/>
+              </w:rPr>
+            </w:pPr>
+            <w:r>
+              <w:rPr>
+                <w:rFonts w:eastAsia="Calibri"/>
+                <w:b w:val="0"/>
+                <w:bCs/>
+                <w:color w:val="000000" w:themeColor="text1"/>
+              </w:rPr>
               <w:t>Comentario respuesta correcta</w:t>
             </w:r>
           </w:p>
@@ -10312,18 +11518,18 @@
               <w:rPr>
                 <w:rFonts w:eastAsia="Calibri"/>
                 <w:b/>
+                <w:bCs/>
                 <w:iCs/>
                 <w:color w:val="000000" w:themeColor="text1"/>
               </w:rPr>
             </w:pPr>
             <w:r>
               <w:rPr>
-                <w:rFonts w:eastAsia="Calibri"/>
-                <w:b/>
-                <w:iCs/>
-                <w:color w:val="000000" w:themeColor="text1"/>
-              </w:rPr>
-              <w:t>La partida doble garantiza que la ecuación patrimonial (Activo = Pasivo + Patrimonio) se mantenga en equilibrio.</w:t>
+                <w:b/>
+                <w:bCs/>
+                <w:color w:val="000000" w:themeColor="text1"/>
+              </w:rPr>
+              <w:t>¿Cuál es el objetivo principal de la cuenta T en el registro contable?</w:t>
             </w:r>
           </w:p>
         </w:tc>
@@ -10346,6 +11552,7 @@
                 <w:lang w:val="pt-PT"/>
               </w:rPr>
             </w:pPr>
+            <w:proofErr w:type="spellStart"/>
             <w:r>
               <w:rPr>
                 <w:rFonts w:eastAsia="Calibri"/>
@@ -10354,7 +11561,40 @@
                 <w:color w:val="000000" w:themeColor="text1"/>
                 <w:lang w:val="pt-PT"/>
               </w:rPr>
-              <w:t>Rta(s) correcta(s) (x)</w:t>
+              <w:t>Rta</w:t>
+            </w:r>
+            <w:proofErr w:type="spellEnd"/>
+            <w:r>
+              <w:rPr>
+                <w:rFonts w:eastAsia="Calibri"/>
+                <w:b/>
+                <w:bCs/>
+                <w:color w:val="000000" w:themeColor="text1"/>
+                <w:lang w:val="pt-PT"/>
+              </w:rPr>
+              <w:t xml:space="preserve">(s) </w:t>
+            </w:r>
+            <w:proofErr w:type="spellStart"/>
+            <w:r>
+              <w:rPr>
+                <w:rFonts w:eastAsia="Calibri"/>
+                <w:b/>
+                <w:bCs/>
+                <w:color w:val="000000" w:themeColor="text1"/>
+                <w:lang w:val="pt-PT"/>
+              </w:rPr>
+              <w:t>correcta</w:t>
+            </w:r>
+            <w:proofErr w:type="spellEnd"/>
+            <w:r>
+              <w:rPr>
+                <w:rFonts w:eastAsia="Calibri"/>
+                <w:b/>
+                <w:bCs/>
+                <w:color w:val="000000" w:themeColor="text1"/>
+                <w:lang w:val="pt-PT"/>
+              </w:rPr>
+              <w:t>(s) (x)</w:t>
             </w:r>
           </w:p>
         </w:tc>
@@ -10399,6 +11639,7 @@
           </w:tcPr>
           <w:p>
             <w:pPr>
+              <w:jc w:val="both"/>
               <w:cnfStyle w:val="000000000000" w:firstRow="0" w:lastRow="0" w:firstColumn="0" w:lastColumn="0" w:oddVBand="0" w:evenVBand="0" w:oddHBand="0" w:evenHBand="0" w:firstRowFirstColumn="0" w:firstRowLastColumn="0" w:lastRowFirstColumn="0" w:lastRowLastColumn="0"/>
               <w:rPr>
                 <w:rFonts w:eastAsia="Calibri"/>
@@ -10409,12 +11650,9 @@
             </w:pPr>
             <w:r>
               <w:rPr>
-                <w:rFonts w:eastAsia="Calibri"/>
-                <w:bCs/>
-                <w:iCs/>
-                <w:color w:val="000000" w:themeColor="text1"/>
-              </w:rPr>
-              <w:t>Falso.</w:t>
+                <w:color w:val="000000" w:themeColor="text1"/>
+              </w:rPr>
+              <w:t>Sustituir los libros contables oficiales en el registro formal de operaciones.</w:t>
             </w:r>
           </w:p>
         </w:tc>
@@ -10480,6 +11718,7 @@
           </w:tcPr>
           <w:p>
             <w:pPr>
+              <w:jc w:val="both"/>
               <w:cnfStyle w:val="000000100000" w:firstRow="0" w:lastRow="0" w:firstColumn="0" w:lastColumn="0" w:oddVBand="0" w:evenVBand="0" w:oddHBand="1" w:evenHBand="0" w:firstRowFirstColumn="0" w:firstRowLastColumn="0" w:lastRowFirstColumn="0" w:lastRowLastColumn="0"/>
               <w:rPr>
                 <w:rFonts w:eastAsia="Calibri"/>
@@ -10490,12 +11729,9 @@
             </w:pPr>
             <w:r>
               <w:rPr>
-                <w:rFonts w:eastAsia="Calibri"/>
-                <w:b/>
-                <w:iCs/>
-                <w:color w:val="000000" w:themeColor="text1"/>
-              </w:rPr>
-              <w:t xml:space="preserve">Verdadero. </w:t>
+                <w:color w:val="000000" w:themeColor="text1"/>
+              </w:rPr>
+              <w:t>Clasificar las empresas según su actividad económica y tamaño empresarial.</w:t>
             </w:r>
           </w:p>
         </w:tc>
@@ -10517,15 +11753,158 @@
                 <w:color w:val="000000" w:themeColor="text1"/>
               </w:rPr>
             </w:pPr>
-            <w:r>
-              <w:rPr>
-                <w:rFonts w:eastAsia="Calibri"/>
-                <w:b/>
-                <w:iCs/>
+          </w:p>
+        </w:tc>
+      </w:tr>
+      <w:tr>
+        <w:trPr>
+          <w:trHeight w:val="220"/>
+        </w:trPr>
+        <w:tc>
+          <w:tcPr>
+            <w:cnfStyle w:val="001000000000" w:firstRow="0" w:lastRow="0" w:firstColumn="1" w:lastColumn="0" w:oddVBand="0" w:evenVBand="0" w:oddHBand="0" w:evenHBand="0" w:firstRowFirstColumn="0" w:firstRowLastColumn="0" w:lastRowFirstColumn="0" w:lastRowLastColumn="0"/>
+            <w:tcW w:w="2534" w:type="dxa"/>
+            <w:gridSpan w:val="2"/>
+            <w:shd w:val="clear" w:color="auto" w:fill="FDE9D9" w:themeFill="accent6" w:themeFillTint="33"/>
+          </w:tcPr>
+          <w:p>
+            <w:pPr>
+              <w:rPr>
+                <w:rFonts w:eastAsia="Calibri"/>
+                <w:bCs/>
+                <w:color w:val="000000" w:themeColor="text1"/>
+              </w:rPr>
+            </w:pPr>
+            <w:r>
+              <w:rPr>
+                <w:rFonts w:eastAsia="Calibri"/>
+                <w:b w:val="0"/>
+                <w:color w:val="000000" w:themeColor="text1"/>
+              </w:rPr>
+              <w:t>Opción c)</w:t>
+            </w:r>
+          </w:p>
+        </w:tc>
+        <w:tc>
+          <w:tcPr>
+            <w:tcW w:w="5512" w:type="dxa"/>
+            <w:gridSpan w:val="4"/>
+            <w:shd w:val="clear" w:color="auto" w:fill="FFFFFF" w:themeFill="background1"/>
+          </w:tcPr>
+          <w:p>
+            <w:pPr>
+              <w:jc w:val="both"/>
+              <w:cnfStyle w:val="000000000000" w:firstRow="0" w:lastRow="0" w:firstColumn="0" w:lastColumn="0" w:oddVBand="0" w:evenVBand="0" w:oddHBand="0" w:evenHBand="0" w:firstRowFirstColumn="0" w:firstRowLastColumn="0" w:lastRowFirstColumn="0" w:lastRowLastColumn="0"/>
+              <w:rPr>
+                <w:rFonts w:eastAsia="Calibri"/>
+                <w:b/>
+                <w:bCs/>
+                <w:color w:val="000000" w:themeColor="text1"/>
+              </w:rPr>
+            </w:pPr>
+            <w:r>
+              <w:rPr>
+                <w:b/>
+                <w:bCs/>
+                <w:color w:val="000000" w:themeColor="text1"/>
+              </w:rPr>
+              <w:t>Visualizar los movimientos y comprobar el equilibrio entre débitos y créditos registrados.</w:t>
+            </w:r>
+          </w:p>
+        </w:tc>
+        <w:tc>
+          <w:tcPr>
+            <w:tcW w:w="2108" w:type="dxa"/>
+            <w:shd w:val="clear" w:color="auto" w:fill="FFFFFF" w:themeFill="background1"/>
+          </w:tcPr>
+          <w:p>
+            <w:pPr>
+              <w:cnfStyle w:val="000000000000" w:firstRow="0" w:lastRow="0" w:firstColumn="0" w:lastColumn="0" w:oddVBand="0" w:evenVBand="0" w:oddHBand="0" w:evenHBand="0" w:firstRowFirstColumn="0" w:firstRowLastColumn="0" w:lastRowFirstColumn="0" w:lastRowLastColumn="0"/>
+              <w:rPr>
+                <w:rFonts w:eastAsia="Calibri"/>
+                <w:b/>
+                <w:color w:val="000000" w:themeColor="text1"/>
+              </w:rPr>
+            </w:pPr>
+            <w:r>
+              <w:rPr>
+                <w:rFonts w:eastAsia="Calibri"/>
+                <w:b/>
                 <w:color w:val="000000" w:themeColor="text1"/>
               </w:rPr>
               <w:t>X</w:t>
             </w:r>
+          </w:p>
+        </w:tc>
+      </w:tr>
+      <w:tr>
+        <w:trPr>
+          <w:cnfStyle w:val="000000100000" w:firstRow="0" w:lastRow="0" w:firstColumn="0" w:lastColumn="0" w:oddVBand="0" w:evenVBand="0" w:oddHBand="1" w:evenHBand="0" w:firstRowFirstColumn="0" w:firstRowLastColumn="0" w:lastRowFirstColumn="0" w:lastRowLastColumn="0"/>
+          <w:trHeight w:val="220"/>
+        </w:trPr>
+        <w:tc>
+          <w:tcPr>
+            <w:cnfStyle w:val="001000000000" w:firstRow="0" w:lastRow="0" w:firstColumn="1" w:lastColumn="0" w:oddVBand="0" w:evenVBand="0" w:oddHBand="0" w:evenHBand="0" w:firstRowFirstColumn="0" w:firstRowLastColumn="0" w:lastRowFirstColumn="0" w:lastRowLastColumn="0"/>
+            <w:tcW w:w="2534" w:type="dxa"/>
+            <w:gridSpan w:val="2"/>
+            <w:shd w:val="clear" w:color="auto" w:fill="FDE9D9" w:themeFill="accent6" w:themeFillTint="33"/>
+          </w:tcPr>
+          <w:p>
+            <w:pPr>
+              <w:rPr>
+                <w:rFonts w:eastAsia="Calibri"/>
+                <w:bCs/>
+                <w:color w:val="000000" w:themeColor="text1"/>
+              </w:rPr>
+            </w:pPr>
+            <w:r>
+              <w:rPr>
+                <w:rFonts w:eastAsia="Calibri"/>
+                <w:b w:val="0"/>
+                <w:color w:val="000000" w:themeColor="text1"/>
+              </w:rPr>
+              <w:t>Opción d)</w:t>
+            </w:r>
+          </w:p>
+        </w:tc>
+        <w:tc>
+          <w:tcPr>
+            <w:tcW w:w="5512" w:type="dxa"/>
+            <w:gridSpan w:val="4"/>
+            <w:shd w:val="clear" w:color="auto" w:fill="FFFFFF" w:themeFill="background1"/>
+          </w:tcPr>
+          <w:p>
+            <w:pPr>
+              <w:jc w:val="both"/>
+              <w:cnfStyle w:val="000000100000" w:firstRow="0" w:lastRow="0" w:firstColumn="0" w:lastColumn="0" w:oddVBand="0" w:evenVBand="0" w:oddHBand="1" w:evenHBand="0" w:firstRowFirstColumn="0" w:firstRowLastColumn="0" w:lastRowFirstColumn="0" w:lastRowLastColumn="0"/>
+              <w:rPr>
+                <w:rFonts w:eastAsia="Calibri"/>
+                <w:bCs/>
+                <w:color w:val="000000" w:themeColor="text1"/>
+              </w:rPr>
+            </w:pPr>
+            <w:r>
+              <w:rPr>
+                <w:color w:val="000000" w:themeColor="text1"/>
+              </w:rPr>
+              <w:t>Determinar el valor de los activos sin considerar los pasivos existentes.</w:t>
+            </w:r>
+          </w:p>
+        </w:tc>
+        <w:tc>
+          <w:tcPr>
+            <w:tcW w:w="2108" w:type="dxa"/>
+            <w:shd w:val="clear" w:color="auto" w:fill="FFFFFF" w:themeFill="background1"/>
+          </w:tcPr>
+          <w:p>
+            <w:pPr>
+              <w:cnfStyle w:val="000000100000" w:firstRow="0" w:lastRow="0" w:firstColumn="0" w:lastColumn="0" w:oddVBand="0" w:evenVBand="0" w:oddHBand="1" w:evenHBand="0" w:firstRowFirstColumn="0" w:firstRowLastColumn="0" w:lastRowFirstColumn="0" w:lastRowLastColumn="0"/>
+              <w:rPr>
+                <w:rFonts w:eastAsia="Calibri"/>
+                <w:bCs/>
+                <w:color w:val="000000" w:themeColor="text1"/>
+              </w:rPr>
+            </w:pPr>
           </w:p>
         </w:tc>
       </w:tr>
@@ -11064,9 +12443,9 @@
             </wp:anchor>
           </w:drawing>
         </mc:Choice>
-        <mc:Fallback>
+        <mc:Fallback xmlns:pic="http://schemas.openxmlformats.org/drawingml/2006/picture" xmlns:a="http://schemas.openxmlformats.org/drawingml/2006/main">
           <w:pict>
-            <v:rect w14:anchorId="29C177D3" id="Rectangle 1" o:spid="_x0000_s1026" style="position:absolute;margin-left:-54pt;margin-top:-14.4pt;width:460.5pt;height:112.3pt;z-index:251658241;visibility:visible;mso-wrap-style:square;mso-wrap-distance-left:9pt;mso-wrap-distance-top:3.6pt;mso-wrap-distance-right:9pt;mso-wrap-distance-bottom:3.6pt;mso-position-horizontal:absolute;mso-position-horizontal-relative:text;mso-position-vertical:absolute;mso-position-vertical-relative:text;v-text-anchor:top" o:gfxdata="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" filled="f" stroked="f">
+            <v:rect id="Rectangle 1" style="position:absolute;margin-left:-54pt;margin-top:-14.4pt;width:460.5pt;height:112.3pt;z-index:251658241;visibility:visible;mso-wrap-style:square;mso-wrap-distance-left:9pt;mso-wrap-distance-top:3.6pt;mso-wrap-distance-right:9pt;mso-wrap-distance-bottom:3.6pt;mso-position-horizontal:absolute;mso-position-horizontal-relative:text;mso-position-vertical:absolute;mso-position-vertical-relative:text;v-text-anchor:top" o:spid="_x0000_s1026" filled="f" stroked="f" w14:anchorId="29C177D3" o:gfxdata="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">
               <v:textbox inset="2.53958mm,1.2694mm,2.53958mm,1.2694mm">
                 <w:txbxContent>
                   <w:p>
@@ -12169,6 +13548,7 @@
   <w:style w:type="character" w:default="1" w:styleId="Fuentedeprrafopredeter">
     <w:name w:val="Default Paragraph Font"/>
     <w:uiPriority w:val="1"/>
+    <w:semiHidden/>
     <w:unhideWhenUsed/>
   </w:style>
   <w:style w:type="table" w:default="1" w:styleId="Tablanormal">
@@ -12966,7 +14346,22 @@
 </file>
 
 <file path=customXml/itemProps1.xml><?xml version="1.0" encoding="utf-8"?>
-<ds:datastoreItem xmlns:ds="http://schemas.openxmlformats.org/officeDocument/2006/customXml" ds:itemID="{766A95A1-C38C-45C4-88E0-B69760D10ED2}"/>
+<ds:datastoreItem xmlns:ds="http://schemas.openxmlformats.org/officeDocument/2006/customXml" ds:itemID="{766A95A1-C38C-45C4-88E0-B69760D10ED2}">
+  <ds:schemaRefs>
+    <ds:schemaRef ds:uri="http://schemas.microsoft.com/office/2006/metadata/contentType"/>
+    <ds:schemaRef ds:uri="http://schemas.microsoft.com/office/2006/metadata/properties/metaAttributes"/>
+    <ds:schemaRef ds:uri="http://www.w3.org/2001/XMLSchema"/>
+    <ds:schemaRef ds:uri="http://schemas.microsoft.com/office/2006/metadata/properties"/>
+    <ds:schemaRef ds:uri="13c90a0b-73bc-4dc0-be5f-28d77b615beb"/>
+    <ds:schemaRef ds:uri="13c93bba-48ce-428c-bfe5-88b42c19b028"/>
+    <ds:schemaRef ds:uri="http://schemas.microsoft.com/office/2006/documentManagement/types"/>
+    <ds:schemaRef ds:uri="http://schemas.microsoft.com/office/infopath/2007/PartnerControls"/>
+    <ds:schemaRef ds:uri="http://schemas.openxmlformats.org/package/2006/metadata/core-properties"/>
+    <ds:schemaRef ds:uri="http://purl.org/dc/elements/1.1/"/>
+    <ds:schemaRef ds:uri="http://purl.org/dc/terms/"/>
+    <ds:schemaRef ds:uri="http://schemas.microsoft.com/internal/obd"/>
+  </ds:schemaRefs>
+</ds:datastoreItem>
 </file>
 
 <file path=customXml/itemProps2.xml><?xml version="1.0" encoding="utf-8"?>
@@ -12974,8 +14369,8 @@
   <ds:schemaRefs>
     <ds:schemaRef ds:uri="http://schemas.microsoft.com/office/2006/metadata/properties"/>
     <ds:schemaRef ds:uri="http://schemas.microsoft.com/office/infopath/2007/PartnerControls"/>
-    <ds:schemaRef ds:uri="b250f519-6473-4480-8c44-6ee3a3a530c3"/>
-    <ds:schemaRef ds:uri="d174a4fb-80c2-4523-8d89-375030acacbf"/>
+    <ds:schemaRef ds:uri="13c90a0b-73bc-4dc0-be5f-28d77b615beb"/>
+    <ds:schemaRef ds:uri="13c93bba-48ce-428c-bfe5-88b42c19b028"/>
   </ds:schemaRefs>
 </ds:datastoreItem>
 </file>

</xml_diff>